<commit_message>
Piece 5 - Score and Front Matter Update
</commit_message>
<xml_diff>
--- a/Front Matter/Template/5_Front-Matter.docx
+++ b/Front Matter/Template/5_Front-Matter.docx
@@ -1585,7 +1585,6 @@
     <w:p>
       <w:pPr>
         <w:spacing w:after="640"/>
-        <w:jc w:val="right"/>
         <w:rPr>
           <w:rFonts w:ascii="Noto Serif SC" w:eastAsia="Noto Serif SC" w:hAnsi="Noto Serif SC" w:cs="Noto Serif"/>
           <w:b/>
@@ -1830,51 +1829,19 @@
         </w:rPr>
         <w:t> 听说... </w:t>
       </w:r>
-      <w:r>
-        <w:rPr>
-          <w:rFonts w:ascii="Noto Serif SC" w:eastAsia="Noto Serif SC" w:hAnsi="Noto Serif SC"/>
-        </w:rPr>
-        <w:fldChar w:fldCharType="begin"/>
-      </w:r>
-      <w:r>
-        <w:rPr>
-          <w:rFonts w:ascii="Noto Serif SC" w:eastAsia="Noto Serif SC" w:hAnsi="Noto Serif SC"/>
-        </w:rPr>
-        <w:instrText>HYPERLINK "https://www.jihenglee.com/large-ensemble/2013-heard-that"</w:instrText>
-      </w:r>
-      <w:r>
-        <w:rPr>
-          <w:rFonts w:ascii="Noto Serif SC" w:eastAsia="Noto Serif SC" w:hAnsi="Noto Serif SC"/>
-        </w:rPr>
-      </w:r>
-      <w:r>
-        <w:rPr>
-          <w:rFonts w:ascii="Noto Serif SC" w:eastAsia="Noto Serif SC" w:hAnsi="Noto Serif SC"/>
-        </w:rPr>
-        <w:fldChar w:fldCharType="separate"/>
-      </w:r>
-      <w:r>
-        <w:rPr>
-          <w:rStyle w:val="Hyperlink"/>
-          <w:rFonts w:ascii="Noto Serif SC" w:eastAsia="Noto Serif SC" w:hAnsi="Noto Serif SC" w:cs="Noto Serif"/>
-          <w:i/>
-          <w:iCs/>
-          <w:sz w:val="24"/>
-          <w:szCs w:val="24"/>
-        </w:rPr>
-        <w:t>heard that...</w:t>
-      </w:r>
-      <w:r>
-        <w:rPr>
-          <w:rStyle w:val="Hyperlink"/>
-          <w:rFonts w:ascii="Noto Serif SC" w:eastAsia="Noto Serif SC" w:hAnsi="Noto Serif SC" w:cs="Noto Serif"/>
-          <w:i/>
-          <w:iCs/>
-          <w:sz w:val="24"/>
-          <w:szCs w:val="24"/>
-        </w:rPr>
-        <w:fldChar w:fldCharType="end"/>
-      </w:r>
+      <w:hyperlink r:id="rId13" w:history="1">
+        <w:r>
+          <w:rPr>
+            <w:rStyle w:val="Hyperlink"/>
+            <w:rFonts w:ascii="Noto Serif SC" w:eastAsia="Noto Serif SC" w:hAnsi="Noto Serif SC" w:cs="Noto Serif"/>
+            <w:i/>
+            <w:iCs/>
+            <w:sz w:val="24"/>
+            <w:szCs w:val="24"/>
+          </w:rPr>
+          <w:t>heard that...</w:t>
+        </w:r>
+      </w:hyperlink>
       <w:r>
         <w:rPr>
           <w:rFonts w:ascii="Noto Serif SC" w:eastAsia="Noto Serif SC" w:hAnsi="Noto Serif SC" w:cs="Noto Serif"/>
@@ -2321,7 +2288,7 @@
         </w:rPr>
         <w:t> 短奏曲 (</w:t>
       </w:r>
-      <w:hyperlink r:id="rId13" w:history="1">
+      <w:hyperlink r:id="rId14" w:history="1">
         <w:r>
           <w:rPr>
             <w:rStyle w:val="Hyperlink"/>
@@ -2334,7 +2301,7 @@
           <w:t>Short Piece</w:t>
         </w:r>
       </w:hyperlink>
-      <w:hyperlink r:id="rId14" w:history="1">
+      <w:hyperlink r:id="rId15" w:history="1">
         <w:r>
           <w:rPr>
             <w:rStyle w:val="Hyperlink"/>
@@ -2625,7 +2592,7 @@
         </w:rPr>
         <w:t> </w:t>
       </w:r>
-      <w:hyperlink r:id="rId15" w:history="1">
+      <w:hyperlink r:id="rId16" w:history="1">
         <w:r>
           <w:rPr>
             <w:rStyle w:val="Hyperlink"/>
@@ -2754,7 +2721,7 @@
         </w:rPr>
         <w:t> </w:t>
       </w:r>
-      <w:hyperlink r:id="rId16" w:history="1">
+      <w:hyperlink r:id="rId17" w:history="1">
         <w:r>
           <w:rPr>
             <w:rStyle w:val="Hyperlink"/>
@@ -3612,7 +3579,6 @@
     <w:p>
       <w:pPr>
         <w:spacing w:after="640"/>
-        <w:jc w:val="right"/>
         <w:rPr>
           <w:rFonts w:ascii="Noto Serif SC" w:eastAsia="Noto Serif SC" w:hAnsi="Noto Serif SC" w:cs="Noto Serif"/>
           <w:b/>
@@ -3811,7 +3777,6 @@
     <w:p>
       <w:pPr>
         <w:spacing w:after="640"/>
-        <w:jc w:val="right"/>
         <w:rPr>
           <w:rFonts w:ascii="Noto Serif SC" w:eastAsia="Noto Serif SC" w:hAnsi="Noto Serif SC" w:cs="Noto Serif"/>
           <w:b/>
@@ -3841,7 +3806,6 @@
     </w:p>
     <w:p>
       <w:pPr>
-        <w:jc w:val="right"/>
         <w:rPr>
           <w:rFonts w:ascii="Noto Serif SC" w:eastAsia="Noto Serif SC" w:hAnsi="Noto Serif SC" w:cs="Noto Serif"/>
           <w:sz w:val="24"/>
@@ -3851,11 +3815,20 @@
       </w:pPr>
       <w:r>
         <w:rPr>
-          <w:rFonts w:ascii="Noto Serif SC" w:eastAsia="Noto Serif SC" w:hAnsi="Noto Serif SC" w:cs="Noto Serif" w:hint="eastAsia"/>
+          <w:rFonts w:ascii="Noto Serif SC" w:eastAsia="Noto Serif SC" w:hAnsi="Noto Serif SC" w:cs="Noto Serif"/>
           <w:sz w:val="24"/>
           <w:szCs w:val="24"/>
           <w:lang w:val="en-GB"/>
         </w:rPr>
+        <w:t>1</w:t>
+      </w:r>
+      <w:r>
+        <w:rPr>
+          <w:rFonts w:ascii="Noto Serif SC" w:eastAsia="Noto Serif SC" w:hAnsi="Noto Serif SC" w:cs="Noto Serif" w:hint="eastAsia"/>
+          <w:sz w:val="24"/>
+          <w:szCs w:val="24"/>
+          <w:lang w:val="en-GB"/>
+        </w:rPr>
         <w:t>梆笛</w:t>
       </w:r>
       <w:r>
@@ -3865,7 +3838,16 @@
           <w:szCs w:val="24"/>
           <w:lang w:val="en-GB"/>
         </w:rPr>
-        <w:t xml:space="preserve"> (</w:t>
+        <w:t xml:space="preserve"> </w:t>
+      </w:r>
+      <w:r>
+        <w:rPr>
+          <w:rFonts w:ascii="Noto Serif SC" w:eastAsia="Noto Serif SC" w:hAnsi="Noto Serif SC" w:cs="Noto Serif"/>
+          <w:sz w:val="24"/>
+          <w:szCs w:val="24"/>
+          <w:lang w:val="en-GB"/>
+        </w:rPr>
+        <w:t xml:space="preserve">1 </w:t>
       </w:r>
       <w:proofErr w:type="spellStart"/>
       <w:r>
@@ -3878,43 +3860,109 @@
         <w:t>Bangdi</w:t>
       </w:r>
       <w:proofErr w:type="spellEnd"/>
-      <w:r>
+    </w:p>
+    <w:p>
+      <w:pPr>
+        <w:rPr>
+          <w:rFonts w:ascii="Noto Serif SC" w:eastAsia="Noto Serif SC" w:hAnsi="Noto Serif SC" w:cs="Noto Serif"/>
+          <w:sz w:val="24"/>
+          <w:szCs w:val="24"/>
+          <w:lang w:val="en-US"/>
+        </w:rPr>
+      </w:pPr>
+      <w:r>
+        <w:rPr>
+          <w:rFonts w:ascii="Noto Serif SC" w:eastAsia="Noto Serif SC" w:hAnsi="Noto Serif SC" w:cs="Noto Serif"/>
+          <w:sz w:val="24"/>
+          <w:szCs w:val="24"/>
+          <w:lang w:val="en-US"/>
+        </w:rPr>
+        <w:t>1</w:t>
+      </w:r>
+      <w:r>
+        <w:rPr>
+          <w:rFonts w:ascii="Noto Serif SC" w:eastAsia="Noto Serif SC" w:hAnsi="Noto Serif SC" w:cs="Noto Serif" w:hint="eastAsia"/>
+          <w:sz w:val="24"/>
+          <w:szCs w:val="24"/>
+          <w:lang w:val="en-US"/>
+        </w:rPr>
+        <w:t>曲笛</w:t>
+      </w:r>
+      <w:r>
+        <w:rPr>
+          <w:rFonts w:ascii="Noto Serif SC" w:eastAsia="Noto Serif SC" w:hAnsi="Noto Serif SC" w:cs="Noto Serif"/>
+          <w:sz w:val="24"/>
+          <w:szCs w:val="24"/>
+          <w:lang w:val="en-US"/>
+        </w:rPr>
+        <w:t xml:space="preserve"> </w:t>
+      </w:r>
+      <w:r>
+        <w:rPr>
+          <w:rFonts w:ascii="Noto Serif SC" w:eastAsia="Noto Serif SC" w:hAnsi="Noto Serif SC" w:cs="Noto Serif"/>
+          <w:sz w:val="24"/>
+          <w:szCs w:val="24"/>
+          <w:lang w:val="en-US"/>
+        </w:rPr>
+        <w:t xml:space="preserve">1 </w:t>
+      </w:r>
+      <w:proofErr w:type="spellStart"/>
+      <w:r>
+        <w:rPr>
+          <w:rFonts w:ascii="Noto Serif SC" w:eastAsia="Noto Serif SC" w:hAnsi="Noto Serif SC" w:cs="Noto Serif"/>
+          <w:sz w:val="24"/>
+          <w:szCs w:val="24"/>
+          <w:lang w:val="en-US"/>
+        </w:rPr>
+        <w:t>Qudi</w:t>
+      </w:r>
+      <w:proofErr w:type="spellEnd"/>
+    </w:p>
+    <w:p>
+      <w:pPr>
+        <w:spacing w:after="120"/>
         <w:rPr>
           <w:rFonts w:ascii="Noto Serif SC" w:eastAsia="Noto Serif SC" w:hAnsi="Noto Serif SC" w:cs="Noto Serif"/>
           <w:sz w:val="24"/>
           <w:szCs w:val="24"/>
           <w:lang w:val="en-GB"/>
         </w:rPr>
-        <w:t>)</w:t>
-      </w:r>
-    </w:p>
-    <w:p>
-      <w:pPr>
-        <w:jc w:val="right"/>
-        <w:rPr>
-          <w:rFonts w:ascii="Noto Serif SC" w:eastAsia="Noto Serif SC" w:hAnsi="Noto Serif SC" w:cs="Noto Serif"/>
-          <w:sz w:val="24"/>
-          <w:szCs w:val="24"/>
-          <w:lang w:val="en-US"/>
-        </w:rPr>
-      </w:pPr>
-      <w:r>
-        <w:rPr>
-          <w:rFonts w:ascii="Noto Serif SC" w:eastAsia="Noto Serif SC" w:hAnsi="Noto Serif SC" w:cs="Noto Serif" w:hint="eastAsia"/>
-          <w:sz w:val="24"/>
-          <w:szCs w:val="24"/>
-          <w:lang w:val="en-US"/>
-        </w:rPr>
-        <w:t>曲笛</w:t>
-      </w:r>
-      <w:r>
-        <w:rPr>
-          <w:rFonts w:ascii="Noto Serif SC" w:eastAsia="Noto Serif SC" w:hAnsi="Noto Serif SC" w:cs="Noto Serif"/>
-          <w:sz w:val="24"/>
-          <w:szCs w:val="24"/>
-          <w:lang w:val="en-US"/>
-        </w:rPr>
-        <w:t xml:space="preserve"> (</w:t>
+      </w:pPr>
+      <w:r>
+        <w:rPr>
+          <w:rFonts w:ascii="Noto Serif SC" w:eastAsia="Noto Serif SC" w:hAnsi="Noto Serif SC" w:cs="Noto Serif"/>
+          <w:sz w:val="24"/>
+          <w:szCs w:val="24"/>
+          <w:lang w:val="en-GB"/>
+        </w:rPr>
+        <w:t>1</w:t>
+      </w:r>
+      <w:r>
+        <w:rPr>
+          <w:rFonts w:ascii="Noto Serif SC" w:eastAsia="Noto Serif SC" w:hAnsi="Noto Serif SC" w:cs="Noto Serif" w:hint="eastAsia"/>
+          <w:sz w:val="24"/>
+          <w:szCs w:val="24"/>
+          <w:lang w:val="en-GB"/>
+        </w:rPr>
+        <w:t>新笛</w:t>
+      </w:r>
+      <w:r>
+        <w:rPr>
+          <w:rFonts w:ascii="Noto Serif SC" w:eastAsia="Noto Serif SC" w:hAnsi="Noto Serif SC" w:cs="Noto Serif"/>
+          <w:sz w:val="24"/>
+          <w:szCs w:val="24"/>
+          <w:lang w:val="en-GB"/>
+        </w:rPr>
+        <w:t>1</w:t>
+      </w:r>
+      <w:r>
+        <w:rPr>
+          <w:rFonts w:ascii="Noto Serif SC" w:eastAsia="Noto Serif SC" w:hAnsi="Noto Serif SC" w:cs="Noto Serif"/>
+          <w:sz w:val="24"/>
+          <w:szCs w:val="24"/>
+          <w:lang w:val="en-GB"/>
+        </w:rPr>
+        <w:t xml:space="preserve"> </w:t>
       </w:r>
       <w:proofErr w:type="spellStart"/>
       <w:r>
@@ -3922,24 +3970,14 @@
           <w:rFonts w:ascii="Noto Serif SC" w:eastAsia="Noto Serif SC" w:hAnsi="Noto Serif SC" w:cs="Noto Serif"/>
           <w:sz w:val="24"/>
           <w:szCs w:val="24"/>
-          <w:lang w:val="en-US"/>
-        </w:rPr>
-        <w:t>Qudi</w:t>
+          <w:lang w:val="en-GB"/>
+        </w:rPr>
+        <w:t>Xindi</w:t>
       </w:r>
       <w:proofErr w:type="spellEnd"/>
-      <w:r>
-        <w:rPr>
-          <w:rFonts w:ascii="Noto Serif SC" w:eastAsia="Noto Serif SC" w:hAnsi="Noto Serif SC" w:cs="Noto Serif"/>
-          <w:sz w:val="24"/>
-          <w:szCs w:val="24"/>
-          <w:lang w:val="en-US"/>
-        </w:rPr>
-        <w:t>)</w:t>
-      </w:r>
-    </w:p>
-    <w:p>
-      <w:pPr>
-        <w:jc w:val="right"/>
+    </w:p>
+    <w:p>
+      <w:pPr>
         <w:rPr>
           <w:rFonts w:ascii="Noto Serif SC" w:eastAsia="Noto Serif SC" w:hAnsi="Noto Serif SC" w:cs="Noto Serif"/>
           <w:sz w:val="24"/>
@@ -3949,21 +3987,39 @@
       </w:pPr>
       <w:r>
         <w:rPr>
-          <w:rFonts w:ascii="Noto Serif SC" w:eastAsia="Noto Serif SC" w:hAnsi="Noto Serif SC" w:cs="Noto Serif" w:hint="eastAsia"/>
+          <w:rFonts w:ascii="Noto Serif SC" w:eastAsia="Noto Serif SC" w:hAnsi="Noto Serif SC" w:cs="Noto Serif"/>
           <w:sz w:val="24"/>
           <w:szCs w:val="24"/>
           <w:lang w:val="en-GB"/>
         </w:rPr>
-        <w:t>新笛</w:t>
-      </w:r>
-      <w:r>
-        <w:rPr>
-          <w:rFonts w:ascii="Noto Serif SC" w:eastAsia="Noto Serif SC" w:hAnsi="Noto Serif SC" w:cs="Noto Serif"/>
+        <w:t>1</w:t>
+      </w:r>
+      <w:r>
+        <w:rPr>
+          <w:rFonts w:ascii="Noto Serif SC" w:eastAsia="Noto Serif SC" w:hAnsi="Noto Serif SC" w:cs="Noto Serif" w:hint="eastAsia"/>
           <w:sz w:val="24"/>
           <w:szCs w:val="24"/>
           <w:lang w:val="en-GB"/>
         </w:rPr>
-        <w:t xml:space="preserve"> (</w:t>
+        <w:t>高音笙</w:t>
+      </w:r>
+      <w:r>
+        <w:rPr>
+          <w:rFonts w:ascii="Noto Serif SC" w:eastAsia="Noto Serif SC" w:hAnsi="Noto Serif SC" w:cs="Noto Serif"/>
+          <w:sz w:val="24"/>
+          <w:szCs w:val="24"/>
+          <w:lang w:val="en-GB"/>
+        </w:rPr>
+        <w:t xml:space="preserve"> </w:t>
+      </w:r>
+      <w:r>
+        <w:rPr>
+          <w:rFonts w:ascii="Noto Serif SC" w:eastAsia="Noto Serif SC" w:hAnsi="Noto Serif SC" w:cs="Noto Serif"/>
+          <w:sz w:val="24"/>
+          <w:szCs w:val="24"/>
+          <w:lang w:val="en-GB"/>
+        </w:rPr>
+        <w:t xml:space="preserve">1 </w:t>
       </w:r>
       <w:proofErr w:type="spellStart"/>
       <w:r>
@@ -3973,7 +4029,7 @@
           <w:szCs w:val="24"/>
           <w:lang w:val="en-GB"/>
         </w:rPr>
-        <w:t>Xindi</w:t>
+        <w:t>Gaoyin</w:t>
       </w:r>
       <w:proofErr w:type="spellEnd"/>
       <w:r>
@@ -3983,23 +4039,11 @@
           <w:szCs w:val="24"/>
           <w:lang w:val="en-GB"/>
         </w:rPr>
-        <w:t>)</w:t>
-      </w:r>
-    </w:p>
-    <w:p>
-      <w:pPr>
-        <w:jc w:val="right"/>
-        <w:rPr>
-          <w:rFonts w:ascii="Noto Serif SC" w:eastAsia="Noto Serif SC" w:hAnsi="Noto Serif SC" w:cs="Noto Serif"/>
-          <w:sz w:val="24"/>
-          <w:szCs w:val="24"/>
-          <w:lang w:val="en-US"/>
-        </w:rPr>
-      </w:pPr>
-    </w:p>
-    <w:p>
-      <w:pPr>
-        <w:jc w:val="right"/>
+        <w:t xml:space="preserve"> Sheng</w:t>
+      </w:r>
+    </w:p>
+    <w:p>
+      <w:pPr>
         <w:rPr>
           <w:rFonts w:ascii="Noto Serif SC" w:eastAsia="Noto Serif SC" w:hAnsi="Noto Serif SC" w:cs="Noto Serif"/>
           <w:sz w:val="24"/>
@@ -4009,21 +4053,39 @@
       </w:pPr>
       <w:r>
         <w:rPr>
-          <w:rFonts w:ascii="Noto Serif SC" w:eastAsia="Noto Serif SC" w:hAnsi="Noto Serif SC" w:cs="Noto Serif" w:hint="eastAsia"/>
+          <w:rFonts w:ascii="Noto Serif SC" w:eastAsia="Noto Serif SC" w:hAnsi="Noto Serif SC" w:cs="Noto Serif"/>
           <w:sz w:val="24"/>
           <w:szCs w:val="24"/>
           <w:lang w:val="en-GB"/>
         </w:rPr>
-        <w:t>高音笙</w:t>
-      </w:r>
-      <w:r>
-        <w:rPr>
-          <w:rFonts w:ascii="Noto Serif SC" w:eastAsia="Noto Serif SC" w:hAnsi="Noto Serif SC" w:cs="Noto Serif"/>
+        <w:t>1</w:t>
+      </w:r>
+      <w:r>
+        <w:rPr>
+          <w:rFonts w:ascii="Noto Serif SC" w:eastAsia="Noto Serif SC" w:hAnsi="Noto Serif SC" w:cs="Noto Serif" w:hint="eastAsia"/>
           <w:sz w:val="24"/>
           <w:szCs w:val="24"/>
           <w:lang w:val="en-GB"/>
         </w:rPr>
-        <w:t xml:space="preserve"> (</w:t>
+        <w:t>中音笙</w:t>
+      </w:r>
+      <w:r>
+        <w:rPr>
+          <w:rFonts w:ascii="Noto Serif SC" w:eastAsia="Noto Serif SC" w:hAnsi="Noto Serif SC" w:cs="Noto Serif"/>
+          <w:sz w:val="24"/>
+          <w:szCs w:val="24"/>
+          <w:lang w:val="en-GB"/>
+        </w:rPr>
+        <w:t xml:space="preserve"> </w:t>
+      </w:r>
+      <w:r>
+        <w:rPr>
+          <w:rFonts w:ascii="Noto Serif SC" w:eastAsia="Noto Serif SC" w:hAnsi="Noto Serif SC" w:cs="Noto Serif"/>
+          <w:sz w:val="24"/>
+          <w:szCs w:val="24"/>
+          <w:lang w:val="en-GB"/>
+        </w:rPr>
+        <w:t xml:space="preserve">1 </w:t>
       </w:r>
       <w:proofErr w:type="spellStart"/>
       <w:r>
@@ -4033,6 +4095,139 @@
           <w:szCs w:val="24"/>
           <w:lang w:val="en-GB"/>
         </w:rPr>
+        <w:t>Zhongyin</w:t>
+      </w:r>
+      <w:proofErr w:type="spellEnd"/>
+      <w:r>
+        <w:rPr>
+          <w:rFonts w:ascii="Noto Serif SC" w:eastAsia="Noto Serif SC" w:hAnsi="Noto Serif SC" w:cs="Noto Serif"/>
+          <w:sz w:val="24"/>
+          <w:szCs w:val="24"/>
+          <w:lang w:val="en-GB"/>
+        </w:rPr>
+        <w:t xml:space="preserve"> Sheng</w:t>
+      </w:r>
+    </w:p>
+    <w:p>
+      <w:pPr>
+        <w:spacing w:after="120"/>
+        <w:rPr>
+          <w:rFonts w:ascii="Noto Serif SC" w:eastAsia="Noto Serif SC" w:hAnsi="Noto Serif SC" w:cs="Noto Serif"/>
+          <w:sz w:val="24"/>
+          <w:szCs w:val="24"/>
+          <w:lang w:val="en-GB"/>
+        </w:rPr>
+      </w:pPr>
+      <w:r>
+        <w:rPr>
+          <w:rFonts w:ascii="Noto Serif SC" w:eastAsia="Noto Serif SC" w:hAnsi="Noto Serif SC" w:cs="Noto Serif"/>
+          <w:sz w:val="24"/>
+          <w:szCs w:val="24"/>
+          <w:lang w:val="en-GB"/>
+        </w:rPr>
+        <w:t>1</w:t>
+      </w:r>
+      <w:r>
+        <w:rPr>
+          <w:rFonts w:ascii="Noto Serif SC" w:eastAsia="Noto Serif SC" w:hAnsi="Noto Serif SC" w:cs="Noto Serif" w:hint="eastAsia"/>
+          <w:sz w:val="24"/>
+          <w:szCs w:val="24"/>
+          <w:lang w:val="en-GB"/>
+        </w:rPr>
+        <w:t>低音笙</w:t>
+      </w:r>
+      <w:r>
+        <w:rPr>
+          <w:rFonts w:ascii="Noto Serif SC" w:eastAsia="Noto Serif SC" w:hAnsi="Noto Serif SC" w:cs="Noto Serif"/>
+          <w:sz w:val="24"/>
+          <w:szCs w:val="24"/>
+          <w:lang w:val="en-GB"/>
+        </w:rPr>
+        <w:t xml:space="preserve"> </w:t>
+      </w:r>
+      <w:r>
+        <w:rPr>
+          <w:rFonts w:ascii="Noto Serif SC" w:eastAsia="Noto Serif SC" w:hAnsi="Noto Serif SC" w:cs="Noto Serif"/>
+          <w:sz w:val="24"/>
+          <w:szCs w:val="24"/>
+          <w:lang w:val="en-GB"/>
+        </w:rPr>
+        <w:t xml:space="preserve">1 </w:t>
+      </w:r>
+      <w:proofErr w:type="spellStart"/>
+      <w:r>
+        <w:rPr>
+          <w:rFonts w:ascii="Noto Serif SC" w:eastAsia="Noto Serif SC" w:hAnsi="Noto Serif SC" w:cs="Noto Serif"/>
+          <w:sz w:val="24"/>
+          <w:szCs w:val="24"/>
+          <w:lang w:val="en-GB"/>
+        </w:rPr>
+        <w:t>Diyin</w:t>
+      </w:r>
+      <w:proofErr w:type="spellEnd"/>
+      <w:r>
+        <w:rPr>
+          <w:rFonts w:ascii="Noto Serif SC" w:eastAsia="Noto Serif SC" w:hAnsi="Noto Serif SC" w:cs="Noto Serif"/>
+          <w:sz w:val="24"/>
+          <w:szCs w:val="24"/>
+          <w:lang w:val="en-GB"/>
+        </w:rPr>
+        <w:t xml:space="preserve"> Sheng</w:t>
+      </w:r>
+    </w:p>
+    <w:p>
+      <w:pPr>
+        <w:rPr>
+          <w:rFonts w:ascii="Noto Serif SC" w:eastAsia="Noto Serif SC" w:hAnsi="Noto Serif SC" w:cs="Noto Serif"/>
+          <w:sz w:val="24"/>
+          <w:szCs w:val="24"/>
+          <w:lang w:val="en-GB"/>
+        </w:rPr>
+      </w:pPr>
+      <w:r>
+        <w:rPr>
+          <w:rFonts w:ascii="Noto Serif SC" w:eastAsia="Noto Serif SC" w:hAnsi="Noto Serif SC" w:cs="Noto Serif"/>
+          <w:sz w:val="24"/>
+          <w:szCs w:val="24"/>
+          <w:lang w:val="en-GB"/>
+        </w:rPr>
+        <w:t>1</w:t>
+      </w:r>
+      <w:r>
+        <w:rPr>
+          <w:rFonts w:ascii="Noto Serif SC" w:eastAsia="Noto Serif SC" w:hAnsi="Noto Serif SC" w:cs="Noto Serif" w:hint="eastAsia"/>
+          <w:sz w:val="24"/>
+          <w:szCs w:val="24"/>
+          <w:lang w:val="en-GB"/>
+        </w:rPr>
+        <w:t>高音唢呐</w:t>
+      </w:r>
+      <w:r>
+        <w:rPr>
+          <w:rFonts w:ascii="Noto Serif SC" w:eastAsia="Noto Serif SC" w:hAnsi="Noto Serif SC" w:cs="Noto Serif"/>
+          <w:sz w:val="24"/>
+          <w:szCs w:val="24"/>
+          <w:lang w:val="en-GB"/>
+        </w:rPr>
+        <w:t xml:space="preserve"> </w:t>
+      </w:r>
+      <w:r>
+        <w:rPr>
+          <w:rFonts w:ascii="Noto Serif SC" w:eastAsia="Noto Serif SC" w:hAnsi="Noto Serif SC" w:cs="Noto Serif"/>
+          <w:sz w:val="24"/>
+          <w:szCs w:val="24"/>
+          <w:lang w:val="en-GB"/>
+        </w:rPr>
+        <w:t xml:space="preserve">1 </w:t>
+      </w:r>
+      <w:proofErr w:type="spellStart"/>
+      <w:r>
+        <w:rPr>
+          <w:rFonts w:ascii="Noto Serif SC" w:eastAsia="Noto Serif SC" w:hAnsi="Noto Serif SC" w:cs="Noto Serif"/>
+          <w:sz w:val="24"/>
+          <w:szCs w:val="24"/>
+          <w:lang w:val="en-GB"/>
+        </w:rPr>
         <w:t>Gaoyin</w:t>
       </w:r>
       <w:proofErr w:type="spellEnd"/>
@@ -4043,36 +4238,64 @@
           <w:szCs w:val="24"/>
           <w:lang w:val="en-GB"/>
         </w:rPr>
-        <w:t xml:space="preserve"> Sheng)</w:t>
-      </w:r>
-    </w:p>
-    <w:p>
-      <w:pPr>
-        <w:jc w:val="right"/>
+        <w:t xml:space="preserve"> </w:t>
+      </w:r>
+      <w:proofErr w:type="spellStart"/>
+      <w:r>
         <w:rPr>
           <w:rFonts w:ascii="Noto Serif SC" w:eastAsia="Noto Serif SC" w:hAnsi="Noto Serif SC" w:cs="Noto Serif"/>
           <w:sz w:val="24"/>
           <w:szCs w:val="24"/>
           <w:lang w:val="en-GB"/>
         </w:rPr>
-      </w:pPr>
-      <w:r>
-        <w:rPr>
-          <w:rFonts w:ascii="Noto Serif SC" w:eastAsia="Noto Serif SC" w:hAnsi="Noto Serif SC" w:cs="Noto Serif" w:hint="eastAsia"/>
-          <w:sz w:val="24"/>
-          <w:szCs w:val="24"/>
-          <w:lang w:val="en-GB"/>
-        </w:rPr>
-        <w:t>中音笙</w:t>
-      </w:r>
-      <w:r>
-        <w:rPr>
-          <w:rFonts w:ascii="Noto Serif SC" w:eastAsia="Noto Serif SC" w:hAnsi="Noto Serif SC" w:cs="Noto Serif"/>
-          <w:sz w:val="24"/>
-          <w:szCs w:val="24"/>
-          <w:lang w:val="en-GB"/>
-        </w:rPr>
-        <w:t xml:space="preserve"> (</w:t>
+        <w:t>Suona</w:t>
+      </w:r>
+      <w:proofErr w:type="spellEnd"/>
+    </w:p>
+    <w:p>
+      <w:pPr>
+        <w:rPr>
+          <w:rFonts w:ascii="Noto Serif SC" w:eastAsia="Noto Serif SC" w:hAnsi="Noto Serif SC" w:cs="Noto Serif"/>
+          <w:sz w:val="24"/>
+          <w:szCs w:val="24"/>
+          <w:lang w:val="en-US" w:eastAsia="zh-TW"/>
+        </w:rPr>
+      </w:pPr>
+      <w:r>
+        <w:rPr>
+          <w:rFonts w:ascii="Noto Serif SC" w:eastAsia="Noto Serif SC" w:hAnsi="Noto Serif SC" w:cs="Noto Serif"/>
+          <w:sz w:val="24"/>
+          <w:szCs w:val="24"/>
+          <w:lang w:val="en-US" w:eastAsia="zh-TW"/>
+        </w:rPr>
+        <w:t>1</w:t>
+      </w:r>
+      <w:r>
+        <w:rPr>
+          <w:rFonts w:ascii="Noto Serif SC" w:eastAsia="Noto Serif SC" w:hAnsi="Noto Serif SC" w:cs="Noto Serif" w:hint="eastAsia"/>
+          <w:sz w:val="24"/>
+          <w:szCs w:val="24"/>
+          <w:lang w:val="en-US" w:eastAsia="zh-TW"/>
+        </w:rPr>
+        <w:t>次中嗩吶</w:t>
+      </w:r>
+      <w:r>
+        <w:rPr>
+          <w:rFonts w:ascii="Noto Serif SC" w:eastAsia="Noto Serif SC" w:hAnsi="Noto Serif SC" w:cs="Noto Serif"/>
+          <w:sz w:val="24"/>
+          <w:szCs w:val="24"/>
+          <w:lang w:val="en-US" w:eastAsia="zh-TW"/>
+        </w:rPr>
+        <w:t xml:space="preserve"> </w:t>
+      </w:r>
+      <w:r>
+        <w:rPr>
+          <w:rFonts w:ascii="Noto Serif SC" w:eastAsia="Noto Serif SC" w:hAnsi="Noto Serif SC" w:cs="Noto Serif"/>
+          <w:sz w:val="24"/>
+          <w:szCs w:val="24"/>
+          <w:lang w:val="en-US" w:eastAsia="zh-TW"/>
+        </w:rPr>
+        <w:t xml:space="preserve">1 </w:t>
       </w:r>
       <w:proofErr w:type="spellStart"/>
       <w:r>
@@ -4080,9 +4303,9 @@
           <w:rFonts w:ascii="Noto Serif SC" w:eastAsia="Noto Serif SC" w:hAnsi="Noto Serif SC" w:cs="Noto Serif"/>
           <w:sz w:val="24"/>
           <w:szCs w:val="24"/>
-          <w:lang w:val="en-GB"/>
-        </w:rPr>
-        <w:t>Zhongyin</w:t>
+          <w:lang w:eastAsia="zh-TW"/>
+        </w:rPr>
+        <w:t>Cizhongyin</w:t>
       </w:r>
       <w:proofErr w:type="spellEnd"/>
       <w:r>
@@ -4090,38 +4313,9 @@
           <w:rFonts w:ascii="Noto Serif SC" w:eastAsia="Noto Serif SC" w:hAnsi="Noto Serif SC" w:cs="Noto Serif"/>
           <w:sz w:val="24"/>
           <w:szCs w:val="24"/>
-          <w:lang w:val="en-GB"/>
-        </w:rPr>
-        <w:t xml:space="preserve"> Sheng)</w:t>
-      </w:r>
-    </w:p>
-    <w:p>
-      <w:pPr>
-        <w:jc w:val="right"/>
-        <w:rPr>
-          <w:rFonts w:ascii="Noto Serif SC" w:eastAsia="Noto Serif SC" w:hAnsi="Noto Serif SC" w:cs="Noto Serif"/>
-          <w:sz w:val="24"/>
-          <w:szCs w:val="24"/>
-          <w:lang w:val="en-GB"/>
-        </w:rPr>
-      </w:pPr>
-      <w:r>
-        <w:rPr>
-          <w:rFonts w:ascii="Noto Serif SC" w:eastAsia="Noto Serif SC" w:hAnsi="Noto Serif SC" w:cs="Noto Serif" w:hint="eastAsia"/>
-          <w:sz w:val="24"/>
-          <w:szCs w:val="24"/>
-          <w:lang w:val="en-GB"/>
-        </w:rPr>
-        <w:t>低音笙</w:t>
-      </w:r>
-      <w:r>
-        <w:rPr>
-          <w:rFonts w:ascii="Noto Serif SC" w:eastAsia="Noto Serif SC" w:hAnsi="Noto Serif SC" w:cs="Noto Serif"/>
-          <w:sz w:val="24"/>
-          <w:szCs w:val="24"/>
-          <w:lang w:val="en-GB"/>
-        </w:rPr>
-        <w:t xml:space="preserve"> (</w:t>
+          <w:lang w:eastAsia="zh-TW"/>
+        </w:rPr>
+        <w:t xml:space="preserve"> </w:t>
       </w:r>
       <w:proofErr w:type="spellStart"/>
       <w:r>
@@ -4129,7 +4323,65 @@
           <w:rFonts w:ascii="Noto Serif SC" w:eastAsia="Noto Serif SC" w:hAnsi="Noto Serif SC" w:cs="Noto Serif"/>
           <w:sz w:val="24"/>
           <w:szCs w:val="24"/>
-          <w:lang w:val="en-GB"/>
+          <w:lang w:val="en-US" w:eastAsia="zh-TW"/>
+        </w:rPr>
+        <w:t>Suona</w:t>
+      </w:r>
+      <w:proofErr w:type="spellEnd"/>
+    </w:p>
+    <w:p>
+      <w:pPr>
+        <w:spacing w:after="120"/>
+        <w:rPr>
+          <w:rFonts w:ascii="Noto Serif SC" w:eastAsia="Noto Serif SC" w:hAnsi="Noto Serif SC" w:cs="Noto Serif"/>
+          <w:sz w:val="24"/>
+          <w:szCs w:val="24"/>
+          <w:lang w:val="en-US" w:eastAsia="zh-TW"/>
+        </w:rPr>
+      </w:pPr>
+      <w:r>
+        <w:rPr>
+          <w:rFonts w:ascii="Noto Serif SC" w:eastAsia="Noto Serif SC" w:hAnsi="Noto Serif SC" w:cs="Noto Serif"/>
+          <w:sz w:val="24"/>
+          <w:szCs w:val="24"/>
+          <w:lang w:val="en-US" w:eastAsia="zh-TW"/>
+        </w:rPr>
+        <w:t>1</w:t>
+      </w:r>
+      <w:r>
+        <w:rPr>
+          <w:rFonts w:ascii="Noto Serif SC" w:eastAsia="Noto Serif SC" w:hAnsi="Noto Serif SC" w:cs="Noto Serif" w:hint="eastAsia"/>
+          <w:sz w:val="24"/>
+          <w:szCs w:val="24"/>
+          <w:lang w:eastAsia="zh-TW"/>
+        </w:rPr>
+        <w:t>低音嗩吶</w:t>
+      </w:r>
+      <w:r>
+        <w:rPr>
+          <w:rFonts w:ascii="Noto Serif SC" w:eastAsia="Noto Serif SC" w:hAnsi="Noto Serif SC" w:cs="Noto Serif"/>
+          <w:sz w:val="24"/>
+          <w:szCs w:val="24"/>
+          <w:lang w:eastAsia="zh-TW"/>
+        </w:rPr>
+        <w:t xml:space="preserve"> </w:t>
+      </w:r>
+      <w:r>
+        <w:rPr>
+          <w:rFonts w:ascii="Noto Serif SC" w:eastAsia="Noto Serif SC" w:hAnsi="Noto Serif SC" w:cs="Noto Serif"/>
+          <w:sz w:val="24"/>
+          <w:szCs w:val="24"/>
+          <w:lang w:val="en-US" w:eastAsia="zh-TW"/>
+        </w:rPr>
+        <w:t xml:space="preserve">1 </w:t>
+      </w:r>
+      <w:proofErr w:type="spellStart"/>
+      <w:r>
+        <w:rPr>
+          <w:rFonts w:ascii="Noto Serif SC" w:eastAsia="Noto Serif SC" w:hAnsi="Noto Serif SC" w:cs="Noto Serif"/>
+          <w:sz w:val="24"/>
+          <w:szCs w:val="24"/>
+          <w:lang w:eastAsia="zh-TW"/>
         </w:rPr>
         <w:t>Diyin</w:t>
       </w:r>
@@ -4139,49 +4391,9 @@
           <w:rFonts w:ascii="Noto Serif SC" w:eastAsia="Noto Serif SC" w:hAnsi="Noto Serif SC" w:cs="Noto Serif"/>
           <w:sz w:val="24"/>
           <w:szCs w:val="24"/>
-          <w:lang w:val="en-GB"/>
-        </w:rPr>
-        <w:t xml:space="preserve"> Sheng)</w:t>
-      </w:r>
-    </w:p>
-    <w:p>
-      <w:pPr>
-        <w:jc w:val="right"/>
-        <w:rPr>
-          <w:rFonts w:ascii="Noto Serif SC" w:eastAsia="Noto Serif SC" w:hAnsi="Noto Serif SC" w:cs="Noto Serif"/>
-          <w:sz w:val="24"/>
-          <w:szCs w:val="24"/>
-          <w:lang w:val="en-US"/>
-        </w:rPr>
-      </w:pPr>
-    </w:p>
-    <w:p>
-      <w:pPr>
-        <w:jc w:val="right"/>
-        <w:rPr>
-          <w:rFonts w:ascii="Noto Serif SC" w:eastAsia="Noto Serif SC" w:hAnsi="Noto Serif SC" w:cs="Noto Serif"/>
-          <w:sz w:val="24"/>
-          <w:szCs w:val="24"/>
-          <w:lang w:val="en-GB"/>
-        </w:rPr>
-      </w:pPr>
-      <w:r>
-        <w:rPr>
-          <w:rFonts w:ascii="Noto Serif SC" w:eastAsia="Noto Serif SC" w:hAnsi="Noto Serif SC" w:cs="Noto Serif" w:hint="eastAsia"/>
-          <w:sz w:val="24"/>
-          <w:szCs w:val="24"/>
-          <w:lang w:val="en-GB"/>
-        </w:rPr>
-        <w:t>高音唢呐</w:t>
-      </w:r>
-      <w:r>
-        <w:rPr>
-          <w:rFonts w:ascii="Noto Serif SC" w:eastAsia="Noto Serif SC" w:hAnsi="Noto Serif SC" w:cs="Noto Serif"/>
-          <w:sz w:val="24"/>
-          <w:szCs w:val="24"/>
-          <w:lang w:val="en-GB"/>
-        </w:rPr>
-        <w:t xml:space="preserve"> (</w:t>
+          <w:lang w:eastAsia="zh-TW"/>
+        </w:rPr>
+        <w:t xml:space="preserve"> </w:t>
       </w:r>
       <w:proofErr w:type="spellStart"/>
       <w:r>
@@ -4189,86 +4401,584 @@
           <w:rFonts w:ascii="Noto Serif SC" w:eastAsia="Noto Serif SC" w:hAnsi="Noto Serif SC" w:cs="Noto Serif"/>
           <w:sz w:val="24"/>
           <w:szCs w:val="24"/>
-          <w:lang w:val="en-GB"/>
-        </w:rPr>
-        <w:t>Gaoyin</w:t>
+          <w:lang w:eastAsia="zh-TW"/>
+        </w:rPr>
+        <w:t>Suona</w:t>
       </w:r>
       <w:proofErr w:type="spellEnd"/>
-      <w:r>
-        <w:rPr>
-          <w:rFonts w:ascii="Noto Serif SC" w:eastAsia="Noto Serif SC" w:hAnsi="Noto Serif SC" w:cs="Noto Serif"/>
-          <w:sz w:val="24"/>
-          <w:szCs w:val="24"/>
-          <w:lang w:val="en-GB"/>
+    </w:p>
+    <w:p>
+      <w:pPr>
+        <w:rPr>
+          <w:rFonts w:ascii="Noto Serif SC" w:eastAsia="Noto Serif SC" w:hAnsi="Noto Serif SC" w:cs="Noto Serif"/>
+          <w:sz w:val="24"/>
+          <w:szCs w:val="24"/>
+          <w:lang w:val="en-US"/>
+        </w:rPr>
+      </w:pPr>
+      <w:r>
+        <w:rPr>
+          <w:rFonts w:ascii="Noto Serif SC" w:eastAsia="Noto Serif SC" w:hAnsi="Noto Serif SC" w:cs="Noto Serif"/>
+          <w:sz w:val="24"/>
+          <w:szCs w:val="24"/>
+          <w:lang w:val="en-US"/>
+        </w:rPr>
+        <w:t>1</w:t>
+      </w:r>
+      <w:r>
+        <w:rPr>
+          <w:rFonts w:ascii="Noto Serif SC" w:eastAsia="Noto Serif SC" w:hAnsi="Noto Serif SC" w:cs="Noto Serif"/>
+          <w:sz w:val="24"/>
+          <w:szCs w:val="24"/>
+        </w:rPr>
+        <w:t>箫</w:t>
+      </w:r>
+      <w:r>
+        <w:rPr>
+          <w:rFonts w:ascii="Noto Serif SC" w:eastAsia="Noto Serif SC" w:hAnsi="Noto Serif SC" w:cs="Noto Serif"/>
+          <w:sz w:val="24"/>
+          <w:szCs w:val="24"/>
+          <w:lang w:val="en-US"/>
         </w:rPr>
         <w:t xml:space="preserve"> </w:t>
       </w:r>
+      <w:r>
+        <w:rPr>
+          <w:rFonts w:ascii="Noto Serif SC" w:eastAsia="Noto Serif SC" w:hAnsi="Noto Serif SC" w:cs="Noto Serif"/>
+          <w:sz w:val="24"/>
+          <w:szCs w:val="24"/>
+          <w:lang w:val="en-US"/>
+        </w:rPr>
+        <w:t xml:space="preserve">1 </w:t>
+      </w:r>
+      <w:r>
+        <w:rPr>
+          <w:rFonts w:ascii="Noto Serif SC" w:eastAsia="Noto Serif SC" w:hAnsi="Noto Serif SC" w:cs="Noto Serif"/>
+          <w:sz w:val="24"/>
+          <w:szCs w:val="24"/>
+          <w:lang w:val="en-US"/>
+        </w:rPr>
+        <w:t>Xiao</w:t>
+      </w:r>
+    </w:p>
+    <w:p>
+      <w:pPr>
+        <w:rPr>
+          <w:rFonts w:ascii="Noto Serif SC" w:eastAsia="Noto Serif SC" w:hAnsi="Noto Serif SC" w:cs="Noto Serif"/>
+          <w:sz w:val="24"/>
+          <w:szCs w:val="24"/>
+          <w:lang w:val="en-US"/>
+        </w:rPr>
+      </w:pPr>
+    </w:p>
+    <w:p>
+      <w:pPr>
+        <w:rPr>
+          <w:rFonts w:ascii="Noto Serif SC" w:eastAsia="Noto Serif SC" w:hAnsi="Noto Serif SC" w:cs="Noto Serif"/>
+          <w:sz w:val="24"/>
+          <w:szCs w:val="24"/>
+          <w:lang w:val="en-US"/>
+        </w:rPr>
+      </w:pPr>
+      <w:r>
+        <w:rPr>
+          <w:rFonts w:ascii="Noto Serif SC" w:eastAsia="Noto Serif SC" w:hAnsi="Noto Serif SC" w:cs="Noto Serif"/>
+          <w:sz w:val="24"/>
+          <w:szCs w:val="24"/>
+          <w:lang w:val="en-US"/>
+        </w:rPr>
+        <w:t>1</w:t>
+      </w:r>
+      <w:r>
+        <w:rPr>
+          <w:rFonts w:ascii="Noto Serif SC" w:eastAsia="Noto Serif SC" w:hAnsi="Noto Serif SC" w:cs="Noto Serif" w:hint="eastAsia"/>
+          <w:sz w:val="24"/>
+          <w:szCs w:val="24"/>
+          <w:lang w:val="en-US"/>
+        </w:rPr>
+        <w:t>扬琴</w:t>
+      </w:r>
+      <w:r>
+        <w:rPr>
+          <w:rFonts w:ascii="Noto Serif SC" w:eastAsia="Noto Serif SC" w:hAnsi="Noto Serif SC" w:cs="Noto Serif"/>
+          <w:sz w:val="24"/>
+          <w:szCs w:val="24"/>
+          <w:lang w:val="en-US"/>
+        </w:rPr>
+        <w:t xml:space="preserve"> </w:t>
+      </w:r>
+      <w:r>
+        <w:rPr>
+          <w:rFonts w:ascii="Noto Serif SC" w:eastAsia="Noto Serif SC" w:hAnsi="Noto Serif SC" w:cs="Noto Serif"/>
+          <w:sz w:val="24"/>
+          <w:szCs w:val="24"/>
+          <w:lang w:val="en-US"/>
+        </w:rPr>
+        <w:t xml:space="preserve">1 </w:t>
+      </w:r>
+      <w:r>
+        <w:rPr>
+          <w:rFonts w:ascii="Noto Serif SC" w:eastAsia="Noto Serif SC" w:hAnsi="Noto Serif SC" w:cs="Noto Serif"/>
+          <w:sz w:val="24"/>
+          <w:szCs w:val="24"/>
+          <w:lang w:val="en-US"/>
+        </w:rPr>
+        <w:t>Yangqin</w:t>
+      </w:r>
+    </w:p>
+    <w:p>
+      <w:pPr>
+        <w:rPr>
+          <w:rFonts w:ascii="Noto Serif SC" w:eastAsia="Noto Serif SC" w:hAnsi="Noto Serif SC" w:cs="Noto Serif"/>
+          <w:sz w:val="24"/>
+          <w:szCs w:val="24"/>
+          <w:lang w:val="en-US"/>
+        </w:rPr>
+      </w:pPr>
+      <w:r>
+        <w:rPr>
+          <w:rFonts w:ascii="Noto Serif SC" w:eastAsia="Noto Serif SC" w:hAnsi="Noto Serif SC" w:cs="Noto Serif"/>
+          <w:sz w:val="24"/>
+          <w:szCs w:val="24"/>
+          <w:lang w:val="en-US"/>
+        </w:rPr>
+        <w:t>1</w:t>
+      </w:r>
+      <w:r>
+        <w:rPr>
+          <w:rFonts w:ascii="Noto Serif SC" w:eastAsia="Noto Serif SC" w:hAnsi="Noto Serif SC" w:cs="Noto Serif" w:hint="eastAsia"/>
+          <w:sz w:val="24"/>
+          <w:szCs w:val="24"/>
+          <w:lang w:val="en-US"/>
+        </w:rPr>
+        <w:t>柳琴</w:t>
+      </w:r>
+      <w:r>
+        <w:rPr>
+          <w:rFonts w:ascii="Noto Serif SC" w:eastAsia="Noto Serif SC" w:hAnsi="Noto Serif SC" w:cs="Noto Serif"/>
+          <w:sz w:val="24"/>
+          <w:szCs w:val="24"/>
+          <w:lang w:val="en-US"/>
+        </w:rPr>
+        <w:t xml:space="preserve"> </w:t>
+      </w:r>
+      <w:r>
+        <w:rPr>
+          <w:rFonts w:ascii="Noto Serif SC" w:eastAsia="Noto Serif SC" w:hAnsi="Noto Serif SC" w:cs="Noto Serif"/>
+          <w:sz w:val="24"/>
+          <w:szCs w:val="24"/>
+          <w:lang w:val="en-US"/>
+        </w:rPr>
+        <w:t xml:space="preserve">1 </w:t>
+      </w:r>
       <w:proofErr w:type="spellStart"/>
       <w:r>
         <w:rPr>
           <w:rFonts w:ascii="Noto Serif SC" w:eastAsia="Noto Serif SC" w:hAnsi="Noto Serif SC" w:cs="Noto Serif"/>
           <w:sz w:val="24"/>
           <w:szCs w:val="24"/>
-          <w:lang w:val="en-GB"/>
-        </w:rPr>
-        <w:t>Suona</w:t>
+          <w:lang w:val="en-US"/>
+        </w:rPr>
+        <w:t>Liuqin</w:t>
       </w:r>
       <w:proofErr w:type="spellEnd"/>
-      <w:r>
-        <w:rPr>
-          <w:rFonts w:ascii="Noto Serif SC" w:eastAsia="Noto Serif SC" w:hAnsi="Noto Serif SC" w:cs="Noto Serif"/>
-          <w:sz w:val="24"/>
-          <w:szCs w:val="24"/>
-          <w:lang w:val="en-GB"/>
-        </w:rPr>
-        <w:t>)</w:t>
-      </w:r>
-    </w:p>
-    <w:p>
-      <w:pPr>
-        <w:jc w:val="right"/>
-        <w:rPr>
-          <w:rFonts w:ascii="Noto Serif SC" w:eastAsia="Noto Serif SC" w:hAnsi="Noto Serif SC" w:cs="Noto Serif"/>
-          <w:sz w:val="24"/>
-          <w:szCs w:val="24"/>
-          <w:lang w:val="en-US" w:eastAsia="zh-TW"/>
-        </w:rPr>
-      </w:pPr>
-      <w:r>
-        <w:rPr>
-          <w:rFonts w:ascii="Noto Serif SC" w:eastAsia="Noto Serif SC" w:hAnsi="Noto Serif SC" w:cs="Noto Serif" w:hint="eastAsia"/>
-          <w:sz w:val="24"/>
-          <w:szCs w:val="24"/>
-          <w:lang w:val="en-US" w:eastAsia="zh-TW"/>
-        </w:rPr>
-        <w:t>次中嗩吶</w:t>
-      </w:r>
-      <w:r>
-        <w:rPr>
-          <w:rFonts w:ascii="Noto Serif SC" w:eastAsia="Noto Serif SC" w:hAnsi="Noto Serif SC" w:cs="Noto Serif"/>
-          <w:sz w:val="24"/>
-          <w:szCs w:val="24"/>
-          <w:lang w:val="en-US" w:eastAsia="zh-TW"/>
-        </w:rPr>
-        <w:t xml:space="preserve"> (</w:t>
+    </w:p>
+    <w:p>
+      <w:pPr>
+        <w:rPr>
+          <w:rFonts w:ascii="Noto Serif SC" w:eastAsia="Noto Serif SC" w:hAnsi="Noto Serif SC" w:cs="Noto Serif"/>
+          <w:sz w:val="24"/>
+          <w:szCs w:val="24"/>
+          <w:lang w:val="en-US"/>
+        </w:rPr>
+      </w:pPr>
+      <w:r>
+        <w:rPr>
+          <w:rFonts w:ascii="Noto Serif SC" w:eastAsia="Noto Serif SC" w:hAnsi="Noto Serif SC" w:cs="Noto Serif"/>
+          <w:sz w:val="24"/>
+          <w:szCs w:val="24"/>
+          <w:lang w:val="en-US"/>
+        </w:rPr>
+        <w:t>1</w:t>
+      </w:r>
+      <w:r>
+        <w:rPr>
+          <w:rFonts w:ascii="Noto Serif SC" w:eastAsia="Noto Serif SC" w:hAnsi="Noto Serif SC" w:cs="Noto Serif" w:hint="eastAsia"/>
+          <w:sz w:val="24"/>
+          <w:szCs w:val="24"/>
+          <w:lang w:val="en-US"/>
+        </w:rPr>
+        <w:t>琵琶</w:t>
+      </w:r>
+      <w:r>
+        <w:rPr>
+          <w:rFonts w:ascii="Noto Serif SC" w:eastAsia="Noto Serif SC" w:hAnsi="Noto Serif SC" w:cs="Noto Serif"/>
+          <w:sz w:val="24"/>
+          <w:szCs w:val="24"/>
+          <w:lang w:val="en-US"/>
+        </w:rPr>
+        <w:t xml:space="preserve"> </w:t>
+      </w:r>
+      <w:r>
+        <w:rPr>
+          <w:rFonts w:ascii="Noto Serif SC" w:eastAsia="Noto Serif SC" w:hAnsi="Noto Serif SC" w:cs="Noto Serif"/>
+          <w:sz w:val="24"/>
+          <w:szCs w:val="24"/>
+          <w:lang w:val="en-US"/>
+        </w:rPr>
+        <w:t xml:space="preserve">1 </w:t>
+      </w:r>
+      <w:r>
+        <w:rPr>
+          <w:rFonts w:ascii="Noto Serif SC" w:eastAsia="Noto Serif SC" w:hAnsi="Noto Serif SC" w:cs="Noto Serif"/>
+          <w:sz w:val="24"/>
+          <w:szCs w:val="24"/>
+          <w:lang w:val="en-US"/>
+        </w:rPr>
+        <w:t>Pipa</w:t>
+      </w:r>
+    </w:p>
+    <w:p>
+      <w:pPr>
+        <w:rPr>
+          <w:rFonts w:ascii="Noto Serif SC" w:eastAsia="Noto Serif SC" w:hAnsi="Noto Serif SC" w:cs="Noto Serif"/>
+          <w:sz w:val="24"/>
+          <w:szCs w:val="24"/>
+          <w:lang w:val="en-US"/>
+        </w:rPr>
+      </w:pPr>
+      <w:r>
+        <w:rPr>
+          <w:rFonts w:ascii="Noto Serif SC" w:eastAsia="Noto Serif SC" w:hAnsi="Noto Serif SC" w:cs="Noto Serif"/>
+          <w:sz w:val="24"/>
+          <w:szCs w:val="24"/>
+          <w:lang w:val="en-US"/>
+        </w:rPr>
+        <w:t>1</w:t>
+      </w:r>
+      <w:r>
+        <w:rPr>
+          <w:rFonts w:ascii="Noto Serif SC" w:eastAsia="Noto Serif SC" w:hAnsi="Noto Serif SC" w:cs="Noto Serif" w:hint="eastAsia"/>
+          <w:sz w:val="24"/>
+          <w:szCs w:val="24"/>
+          <w:lang w:val="en-US"/>
+        </w:rPr>
+        <w:t>中阮</w:t>
+      </w:r>
+      <w:r>
+        <w:rPr>
+          <w:rFonts w:ascii="Noto Serif SC" w:eastAsia="Noto Serif SC" w:hAnsi="Noto Serif SC" w:cs="Noto Serif"/>
+          <w:sz w:val="24"/>
+          <w:szCs w:val="24"/>
+          <w:lang w:val="en-US"/>
+        </w:rPr>
+        <w:t xml:space="preserve"> </w:t>
+      </w:r>
+      <w:r>
+        <w:rPr>
+          <w:rFonts w:ascii="Noto Serif SC" w:eastAsia="Noto Serif SC" w:hAnsi="Noto Serif SC" w:cs="Noto Serif"/>
+          <w:sz w:val="24"/>
+          <w:szCs w:val="24"/>
+          <w:lang w:val="en-US"/>
+        </w:rPr>
+        <w:t xml:space="preserve">1 </w:t>
+      </w:r>
+      <w:r>
+        <w:rPr>
+          <w:rFonts w:ascii="Noto Serif SC" w:eastAsia="Noto Serif SC" w:hAnsi="Noto Serif SC" w:cs="Noto Serif"/>
+          <w:sz w:val="24"/>
+          <w:szCs w:val="24"/>
+          <w:lang w:val="en-US"/>
+        </w:rPr>
+        <w:t>Zhongruan</w:t>
+      </w:r>
+    </w:p>
+    <w:p>
+      <w:pPr>
+        <w:rPr>
+          <w:rFonts w:ascii="Noto Serif SC" w:eastAsia="Noto Serif SC" w:hAnsi="Noto Serif SC" w:cs="Noto Serif"/>
+          <w:sz w:val="24"/>
+          <w:szCs w:val="24"/>
+          <w:lang w:val="en-US"/>
+        </w:rPr>
+      </w:pPr>
+      <w:r>
+        <w:rPr>
+          <w:rFonts w:ascii="Noto Serif SC" w:eastAsia="Noto Serif SC" w:hAnsi="Noto Serif SC" w:cs="Noto Serif"/>
+          <w:sz w:val="24"/>
+          <w:szCs w:val="24"/>
+          <w:lang w:val="en-US"/>
+        </w:rPr>
+        <w:t>1</w:t>
+      </w:r>
+      <w:r>
+        <w:rPr>
+          <w:rFonts w:ascii="Noto Serif SC" w:eastAsia="Noto Serif SC" w:hAnsi="Noto Serif SC" w:cs="Noto Serif" w:hint="eastAsia"/>
+          <w:sz w:val="24"/>
+          <w:szCs w:val="24"/>
+        </w:rPr>
+        <w:t>三弦</w:t>
+      </w:r>
+      <w:r>
+        <w:rPr>
+          <w:rFonts w:ascii="Noto Serif SC" w:eastAsia="Noto Serif SC" w:hAnsi="Noto Serif SC" w:cs="Noto Serif"/>
+          <w:sz w:val="24"/>
+          <w:szCs w:val="24"/>
+          <w:lang w:val="en-US"/>
+        </w:rPr>
+        <w:t xml:space="preserve"> </w:t>
+      </w:r>
+      <w:r>
+        <w:rPr>
+          <w:rFonts w:ascii="Noto Serif SC" w:eastAsia="Noto Serif SC" w:hAnsi="Noto Serif SC" w:cs="Noto Serif"/>
+          <w:sz w:val="24"/>
+          <w:szCs w:val="24"/>
+          <w:lang w:val="en-US"/>
+        </w:rPr>
+        <w:t xml:space="preserve">1 </w:t>
+      </w:r>
+      <w:r>
+        <w:rPr>
+          <w:rFonts w:ascii="Noto Serif SC" w:eastAsia="Noto Serif SC" w:hAnsi="Noto Serif SC" w:cs="Noto Serif"/>
+          <w:sz w:val="24"/>
+          <w:szCs w:val="24"/>
+          <w:lang w:val="en-US"/>
+        </w:rPr>
+        <w:t>Sanxian</w:t>
+      </w:r>
+    </w:p>
+    <w:p>
+      <w:pPr>
+        <w:rPr>
+          <w:rFonts w:ascii="Noto Serif SC" w:eastAsia="Noto Serif SC" w:hAnsi="Noto Serif SC" w:cs="Noto Serif"/>
+          <w:sz w:val="24"/>
+          <w:szCs w:val="24"/>
+          <w:lang w:val="en-US"/>
+        </w:rPr>
+      </w:pPr>
+      <w:r>
+        <w:rPr>
+          <w:rFonts w:ascii="Noto Serif SC" w:eastAsia="Noto Serif SC" w:hAnsi="Noto Serif SC" w:cs="Noto Serif"/>
+          <w:sz w:val="24"/>
+          <w:szCs w:val="24"/>
+          <w:lang w:val="en-US"/>
+        </w:rPr>
+        <w:t>1</w:t>
+      </w:r>
+      <w:r>
+        <w:rPr>
+          <w:rFonts w:ascii="Noto Serif SC" w:eastAsia="Noto Serif SC" w:hAnsi="Noto Serif SC" w:cs="Noto Serif" w:hint="eastAsia"/>
+          <w:sz w:val="24"/>
+          <w:szCs w:val="24"/>
+          <w:lang w:val="en-US"/>
+        </w:rPr>
+        <w:t>大阮</w:t>
+      </w:r>
+      <w:r>
+        <w:rPr>
+          <w:rFonts w:ascii="Noto Serif SC" w:eastAsia="Noto Serif SC" w:hAnsi="Noto Serif SC" w:cs="Noto Serif"/>
+          <w:sz w:val="24"/>
+          <w:szCs w:val="24"/>
+          <w:lang w:val="en-US"/>
+        </w:rPr>
+        <w:t xml:space="preserve"> </w:t>
+      </w:r>
+      <w:r>
+        <w:rPr>
+          <w:rFonts w:ascii="Noto Serif SC" w:eastAsia="Noto Serif SC" w:hAnsi="Noto Serif SC" w:cs="Noto Serif"/>
+          <w:sz w:val="24"/>
+          <w:szCs w:val="24"/>
+          <w:lang w:val="en-US"/>
+        </w:rPr>
+        <w:t xml:space="preserve">1 </w:t>
+      </w:r>
+      <w:r>
+        <w:rPr>
+          <w:rFonts w:ascii="Noto Serif SC" w:eastAsia="Noto Serif SC" w:hAnsi="Noto Serif SC" w:cs="Noto Serif"/>
+          <w:sz w:val="24"/>
+          <w:szCs w:val="24"/>
+          <w:lang w:val="en-US"/>
+        </w:rPr>
+        <w:t>Daruan</w:t>
+      </w:r>
+    </w:p>
+    <w:p>
+      <w:pPr>
+        <w:rPr>
+          <w:rFonts w:ascii="Noto Serif SC" w:eastAsia="Noto Serif SC" w:hAnsi="Noto Serif SC" w:cs="Noto Serif"/>
+          <w:sz w:val="24"/>
+          <w:szCs w:val="24"/>
+          <w:lang w:val="en-US"/>
+        </w:rPr>
+      </w:pPr>
+    </w:p>
+    <w:p>
+      <w:pPr>
+        <w:rPr>
+          <w:rFonts w:ascii="Noto Serif SC" w:eastAsia="Noto Serif SC" w:hAnsi="Noto Serif SC" w:cs="Noto Serif"/>
+          <w:sz w:val="24"/>
+          <w:szCs w:val="24"/>
+          <w:lang w:val="en-US"/>
+        </w:rPr>
+      </w:pPr>
+      <w:r>
+        <w:rPr>
+          <w:rFonts w:ascii="Noto Serif SC" w:eastAsia="Noto Serif SC" w:hAnsi="Noto Serif SC" w:cs="Noto Serif"/>
+          <w:sz w:val="24"/>
+          <w:szCs w:val="24"/>
+        </w:rPr>
+        <w:t>5</w:t>
+      </w:r>
+      <w:r>
+        <w:rPr>
+          <w:rFonts w:ascii="Noto Serif SC" w:eastAsia="Noto Serif SC" w:hAnsi="Noto Serif SC" w:cs="Noto Serif" w:hint="eastAsia"/>
+          <w:sz w:val="24"/>
+          <w:szCs w:val="24"/>
+        </w:rPr>
+        <w:t xml:space="preserve"> 打击乐 </w:t>
+      </w:r>
+      <w:r>
+        <w:rPr>
+          <w:rFonts w:ascii="Noto Serif SC" w:eastAsia="Noto Serif SC" w:hAnsi="Noto Serif SC" w:cs="Noto Serif"/>
+          <w:sz w:val="24"/>
+          <w:szCs w:val="24"/>
+        </w:rPr>
+        <w:t>5</w:t>
+      </w:r>
+      <w:r>
+        <w:rPr>
+          <w:rFonts w:ascii="Noto Serif SC" w:eastAsia="Noto Serif SC" w:hAnsi="Noto Serif SC" w:cs="Noto Serif"/>
+          <w:sz w:val="24"/>
+          <w:szCs w:val="24"/>
+        </w:rPr>
+        <w:t xml:space="preserve"> Percussion</w:t>
+      </w:r>
+    </w:p>
+    <w:p>
+      <w:pPr>
+        <w:rPr>
+          <w:rFonts w:ascii="Noto Serif SC" w:eastAsia="Noto Serif SC" w:hAnsi="Noto Serif SC" w:cs="Noto Serif"/>
+          <w:sz w:val="20"/>
+          <w:szCs w:val="20"/>
+        </w:rPr>
+      </w:pPr>
+      <w:r>
+        <w:rPr>
+          <w:rFonts w:ascii="Noto Serif SC" w:eastAsia="Noto Serif SC" w:hAnsi="Noto Serif SC" w:cs="Noto Serif"/>
+          <w:sz w:val="20"/>
+          <w:szCs w:val="20"/>
+          <w:lang w:val="en-US"/>
+        </w:rPr>
+        <w:t xml:space="preserve">I: </w:t>
+      </w:r>
+      <w:r>
+        <w:rPr>
+          <w:rFonts w:ascii="Noto Serif SC" w:eastAsia="Noto Serif SC" w:hAnsi="Noto Serif SC" w:cs="Noto Serif"/>
+          <w:sz w:val="20"/>
+          <w:szCs w:val="20"/>
+        </w:rPr>
+        <w:t xml:space="preserve">定音鼓 </w:t>
+      </w:r>
+      <w:r>
+        <w:rPr>
+          <w:rFonts w:ascii="Noto Serif SC" w:eastAsia="Noto Serif SC" w:hAnsi="Noto Serif SC" w:cs="Noto Serif" w:hint="eastAsia"/>
+          <w:sz w:val="20"/>
+          <w:szCs w:val="20"/>
+        </w:rPr>
+        <w:t>Timpani</w:t>
+      </w:r>
+      <w:r>
+        <w:rPr>
+          <w:rFonts w:ascii="Noto Serif SC" w:eastAsia="Noto Serif SC" w:hAnsi="Noto Serif SC" w:cs="Noto Serif"/>
+          <w:sz w:val="20"/>
+          <w:szCs w:val="20"/>
+        </w:rPr>
+        <w:t xml:space="preserve">, </w:t>
+      </w:r>
+      <w:r>
+        <w:rPr>
+          <w:rFonts w:ascii="Noto Serif SC" w:eastAsia="Noto Serif SC" w:hAnsi="Noto Serif SC" w:cs="Noto Serif"/>
+          <w:sz w:val="20"/>
+          <w:szCs w:val="20"/>
+        </w:rPr>
+        <w:t xml:space="preserve">大堂鼓 </w:t>
       </w:r>
       <w:proofErr w:type="spellStart"/>
       <w:r>
         <w:rPr>
           <w:rFonts w:ascii="Noto Serif SC" w:eastAsia="Noto Serif SC" w:hAnsi="Noto Serif SC" w:cs="Noto Serif"/>
-          <w:sz w:val="24"/>
-          <w:szCs w:val="24"/>
-          <w:lang w:eastAsia="zh-TW"/>
-        </w:rPr>
-        <w:t>Cizhongyin</w:t>
+          <w:sz w:val="20"/>
+          <w:szCs w:val="20"/>
+        </w:rPr>
+        <w:t>Datangg</w:t>
+      </w:r>
+      <w:r>
+        <w:rPr>
+          <w:rFonts w:ascii="Noto Serif SC" w:eastAsia="Noto Serif SC" w:hAnsi="Noto Serif SC" w:cs="Noto Serif"/>
+          <w:sz w:val="20"/>
+          <w:szCs w:val="20"/>
+        </w:rPr>
+        <w:t>u</w:t>
       </w:r>
       <w:proofErr w:type="spellEnd"/>
       <w:r>
         <w:rPr>
           <w:rFonts w:ascii="Noto Serif SC" w:eastAsia="Noto Serif SC" w:hAnsi="Noto Serif SC" w:cs="Noto Serif"/>
-          <w:sz w:val="24"/>
-          <w:szCs w:val="24"/>
-          <w:lang w:eastAsia="zh-TW"/>
+          <w:sz w:val="20"/>
+          <w:szCs w:val="20"/>
+        </w:rPr>
+        <w:t xml:space="preserve">, </w:t>
+      </w:r>
+      <w:r>
+        <w:rPr>
+          <w:rFonts w:ascii="Noto Serif SC" w:eastAsia="Noto Serif SC" w:hAnsi="Noto Serif SC" w:cs="Noto Serif"/>
+          <w:sz w:val="20"/>
+          <w:szCs w:val="20"/>
+        </w:rPr>
+        <w:t xml:space="preserve">堂鼓 </w:t>
+      </w:r>
+      <w:proofErr w:type="spellStart"/>
+      <w:r>
+        <w:rPr>
+          <w:rFonts w:ascii="Noto Serif SC" w:eastAsia="Noto Serif SC" w:hAnsi="Noto Serif SC" w:cs="Noto Serif"/>
+          <w:sz w:val="20"/>
+          <w:szCs w:val="20"/>
+        </w:rPr>
+        <w:t>Xiaotanggu</w:t>
+      </w:r>
+      <w:proofErr w:type="spellEnd"/>
+    </w:p>
+    <w:p>
+      <w:pPr>
+        <w:rPr>
+          <w:rFonts w:ascii="Noto Serif SC" w:eastAsia="Noto Serif SC" w:hAnsi="Noto Serif SC" w:cs="Noto Serif"/>
+          <w:sz w:val="20"/>
+          <w:szCs w:val="20"/>
+          <w:lang w:val="en-US"/>
+        </w:rPr>
+      </w:pPr>
+      <w:r>
+        <w:rPr>
+          <w:rFonts w:ascii="Noto Serif SC" w:eastAsia="Noto Serif SC" w:hAnsi="Noto Serif SC" w:cs="Noto Serif"/>
+          <w:sz w:val="20"/>
+          <w:szCs w:val="20"/>
+          <w:lang w:val="en-US"/>
+        </w:rPr>
+        <w:t xml:space="preserve">II: </w:t>
+      </w:r>
+      <w:r>
+        <w:rPr>
+          <w:rFonts w:ascii="Noto Serif SC" w:eastAsia="Noto Serif SC" w:hAnsi="Noto Serif SC" w:cs="Noto Serif" w:hint="eastAsia"/>
+          <w:sz w:val="20"/>
+          <w:szCs w:val="20"/>
+        </w:rPr>
+        <w:t>排鼓</w:t>
+      </w:r>
+      <w:r>
+        <w:rPr>
+          <w:rFonts w:ascii="Noto Serif SC" w:eastAsia="Noto Serif SC" w:hAnsi="Noto Serif SC" w:cs="Noto Serif"/>
+          <w:sz w:val="20"/>
+          <w:szCs w:val="20"/>
         </w:rPr>
         <w:t xml:space="preserve"> </w:t>
       </w:r>
@@ -4276,416 +4986,181 @@
       <w:r>
         <w:rPr>
           <w:rFonts w:ascii="Noto Serif SC" w:eastAsia="Noto Serif SC" w:hAnsi="Noto Serif SC" w:cs="Noto Serif"/>
-          <w:sz w:val="24"/>
-          <w:szCs w:val="24"/>
-          <w:lang w:val="en-US" w:eastAsia="zh-TW"/>
-        </w:rPr>
-        <w:t>Suona</w:t>
+          <w:sz w:val="20"/>
+          <w:szCs w:val="20"/>
+        </w:rPr>
+        <w:t>Paigu</w:t>
       </w:r>
       <w:proofErr w:type="spellEnd"/>
       <w:r>
         <w:rPr>
           <w:rFonts w:ascii="Noto Serif SC" w:eastAsia="Noto Serif SC" w:hAnsi="Noto Serif SC" w:cs="Noto Serif"/>
-          <w:sz w:val="24"/>
-          <w:szCs w:val="24"/>
-          <w:lang w:val="en-US" w:eastAsia="zh-TW"/>
-        </w:rPr>
-        <w:t>)</w:t>
-      </w:r>
-    </w:p>
-    <w:p>
-      <w:pPr>
-        <w:jc w:val="right"/>
-        <w:rPr>
-          <w:rFonts w:ascii="Noto Serif SC" w:eastAsia="Noto Serif SC" w:hAnsi="Noto Serif SC" w:cs="Noto Serif"/>
-          <w:sz w:val="24"/>
-          <w:szCs w:val="24"/>
-          <w:lang w:val="en-US" w:eastAsia="zh-TW"/>
-        </w:rPr>
-      </w:pPr>
-      <w:r>
-        <w:rPr>
-          <w:rFonts w:ascii="Noto Serif SC" w:eastAsia="Noto Serif SC" w:hAnsi="Noto Serif SC" w:cs="Noto Serif" w:hint="eastAsia"/>
-          <w:sz w:val="24"/>
-          <w:szCs w:val="24"/>
-          <w:lang w:eastAsia="zh-TW"/>
-        </w:rPr>
-        <w:t>低音嗩吶</w:t>
-      </w:r>
-      <w:r>
-        <w:rPr>
-          <w:rFonts w:ascii="Noto Serif SC" w:eastAsia="Noto Serif SC" w:hAnsi="Noto Serif SC" w:cs="Noto Serif"/>
-          <w:sz w:val="24"/>
-          <w:szCs w:val="24"/>
-          <w:lang w:eastAsia="zh-TW"/>
+          <w:sz w:val="20"/>
+          <w:szCs w:val="20"/>
+        </w:rPr>
+        <w:t xml:space="preserve">, </w:t>
+      </w:r>
+      <w:r>
+        <w:rPr>
+          <w:rFonts w:ascii="Noto Serif SC" w:eastAsia="Noto Serif SC" w:hAnsi="Noto Serif SC" w:cs="Noto Serif"/>
+          <w:sz w:val="20"/>
+          <w:szCs w:val="20"/>
+        </w:rPr>
+        <w:t>铃鼓 Tambourine</w:t>
+      </w:r>
+    </w:p>
+    <w:p>
+      <w:pPr>
+        <w:rPr>
+          <w:rFonts w:ascii="Noto Serif SC" w:eastAsia="Noto Serif SC" w:hAnsi="Noto Serif SC" w:cs="Noto Serif"/>
+          <w:sz w:val="20"/>
+          <w:szCs w:val="20"/>
+        </w:rPr>
+      </w:pPr>
+      <w:r>
+        <w:rPr>
+          <w:rFonts w:ascii="Noto Serif SC" w:eastAsia="Noto Serif SC" w:hAnsi="Noto Serif SC" w:cs="Noto Serif"/>
+          <w:sz w:val="20"/>
+          <w:szCs w:val="20"/>
+          <w:lang w:val="en-US"/>
+        </w:rPr>
+        <w:t xml:space="preserve">III: </w:t>
+      </w:r>
+      <w:r>
+        <w:rPr>
+          <w:rFonts w:ascii="Noto Serif SC" w:eastAsia="Noto Serif SC" w:hAnsi="Noto Serif SC" w:cs="Noto Serif" w:hint="eastAsia"/>
+          <w:sz w:val="20"/>
+          <w:szCs w:val="20"/>
+        </w:rPr>
+        <w:t>云锣</w:t>
+      </w:r>
+      <w:r>
+        <w:rPr>
+          <w:rFonts w:ascii="Noto Serif SC" w:eastAsia="Noto Serif SC" w:hAnsi="Noto Serif SC" w:cs="Noto Serif"/>
+          <w:sz w:val="20"/>
+          <w:szCs w:val="20"/>
+        </w:rPr>
+        <w:t xml:space="preserve"> Yunluo,</w:t>
+      </w:r>
+      <w:r>
+        <w:rPr>
+          <w:rFonts w:ascii="Noto Serif SC" w:eastAsia="Noto Serif SC" w:hAnsi="Noto Serif SC" w:cs="Noto Serif"/>
+          <w:sz w:val="20"/>
+          <w:szCs w:val="20"/>
+          <w:lang w:val="en-US"/>
         </w:rPr>
         <w:t xml:space="preserve"> </w:t>
       </w:r>
       <w:r>
         <w:rPr>
-          <w:rFonts w:ascii="Noto Serif SC" w:eastAsia="Noto Serif SC" w:hAnsi="Noto Serif SC" w:cs="Noto Serif"/>
-          <w:sz w:val="24"/>
-          <w:szCs w:val="24"/>
-          <w:lang w:val="en-US" w:eastAsia="zh-TW"/>
-        </w:rPr>
-        <w:t>(</w:t>
+          <w:rFonts w:ascii="Noto Serif SC" w:eastAsia="Noto Serif SC" w:hAnsi="Noto Serif SC" w:cs="Noto Serif" w:hint="eastAsia"/>
+          <w:sz w:val="20"/>
+          <w:szCs w:val="20"/>
+        </w:rPr>
+        <w:t>木鱼</w:t>
+      </w:r>
+      <w:r>
+        <w:rPr>
+          <w:rFonts w:ascii="Noto Serif SC" w:eastAsia="Noto Serif SC" w:hAnsi="Noto Serif SC" w:cs="Noto Serif"/>
+          <w:sz w:val="20"/>
+          <w:szCs w:val="20"/>
+        </w:rPr>
+        <w:t xml:space="preserve"> Woodblock,</w:t>
+      </w:r>
+      <w:r>
+        <w:t xml:space="preserve"> </w:t>
+      </w:r>
+      <w:r>
+        <w:rPr>
+          <w:rFonts w:ascii="Noto Serif SC" w:eastAsia="Noto Serif SC" w:hAnsi="Noto Serif SC" w:cs="Noto Serif"/>
+          <w:sz w:val="20"/>
+          <w:szCs w:val="20"/>
+        </w:rPr>
+        <w:t>吊钹 Suspended Cymbal</w:t>
+      </w:r>
+      <w:r>
+        <w:rPr>
+          <w:rFonts w:ascii="Noto Serif SC" w:eastAsia="Noto Serif SC" w:hAnsi="Noto Serif SC" w:cs="Noto Serif"/>
+          <w:sz w:val="20"/>
+          <w:szCs w:val="20"/>
+        </w:rPr>
+        <w:t xml:space="preserve">, </w:t>
+      </w:r>
+      <w:r>
+        <w:rPr>
+          <w:rFonts w:ascii="Noto Serif SC" w:eastAsia="Noto Serif SC" w:hAnsi="Noto Serif SC" w:cs="Noto Serif"/>
+          <w:sz w:val="20"/>
+          <w:szCs w:val="20"/>
+        </w:rPr>
+        <w:t>军镲 Crash Cymbals</w:t>
+      </w:r>
+    </w:p>
+    <w:p>
+      <w:pPr>
+        <w:rPr>
+          <w:rFonts w:ascii="Noto Serif SC" w:eastAsia="Noto Serif SC" w:hAnsi="Noto Serif SC" w:cs="Noto Serif"/>
+          <w:sz w:val="20"/>
+          <w:szCs w:val="20"/>
+        </w:rPr>
+      </w:pPr>
+      <w:r>
+        <w:rPr>
+          <w:rFonts w:ascii="Noto Serif SC" w:eastAsia="Noto Serif SC" w:hAnsi="Noto Serif SC" w:cs="Noto Serif"/>
+          <w:sz w:val="20"/>
+          <w:szCs w:val="20"/>
+          <w:lang w:val="en-US"/>
+        </w:rPr>
+        <w:t xml:space="preserve">IV: </w:t>
+      </w:r>
+      <w:r>
+        <w:rPr>
+          <w:rFonts w:ascii="Noto Serif SC" w:eastAsia="Noto Serif SC" w:hAnsi="Noto Serif SC" w:cs="Noto Serif"/>
+          <w:sz w:val="20"/>
+          <w:szCs w:val="20"/>
+        </w:rPr>
+        <w:t xml:space="preserve">编钟 (下层) </w:t>
       </w:r>
       <w:proofErr w:type="spellStart"/>
       <w:r>
         <w:rPr>
           <w:rFonts w:ascii="Noto Serif SC" w:eastAsia="Noto Serif SC" w:hAnsi="Noto Serif SC" w:cs="Noto Serif"/>
-          <w:sz w:val="24"/>
-          <w:szCs w:val="24"/>
-          <w:lang w:eastAsia="zh-TW"/>
-        </w:rPr>
-        <w:t>Diyin</w:t>
+          <w:sz w:val="20"/>
+          <w:szCs w:val="20"/>
+        </w:rPr>
+        <w:t>Bianzhong</w:t>
       </w:r>
       <w:proofErr w:type="spellEnd"/>
       <w:r>
         <w:rPr>
           <w:rFonts w:ascii="Noto Serif SC" w:eastAsia="Noto Serif SC" w:hAnsi="Noto Serif SC" w:cs="Noto Serif"/>
-          <w:sz w:val="24"/>
-          <w:szCs w:val="24"/>
-          <w:lang w:eastAsia="zh-TW"/>
-        </w:rPr>
-        <w:t xml:space="preserve"> </w:t>
-      </w:r>
-      <w:proofErr w:type="spellStart"/>
-      <w:r>
-        <w:rPr>
-          <w:rFonts w:ascii="Noto Serif SC" w:eastAsia="Noto Serif SC" w:hAnsi="Noto Serif SC" w:cs="Noto Serif"/>
-          <w:sz w:val="24"/>
-          <w:szCs w:val="24"/>
-          <w:lang w:eastAsia="zh-TW"/>
-        </w:rPr>
-        <w:t>Suona</w:t>
-      </w:r>
-      <w:proofErr w:type="spellEnd"/>
-      <w:r>
-        <w:rPr>
-          <w:rFonts w:ascii="Noto Serif SC" w:eastAsia="Noto Serif SC" w:hAnsi="Noto Serif SC" w:cs="Noto Serif"/>
-          <w:sz w:val="24"/>
-          <w:szCs w:val="24"/>
-          <w:lang w:val="en-US" w:eastAsia="zh-TW"/>
-        </w:rPr>
-        <w:t>)</w:t>
-      </w:r>
-    </w:p>
-    <w:p>
-      <w:pPr>
-        <w:jc w:val="right"/>
-        <w:rPr>
-          <w:rFonts w:ascii="Noto Serif SC" w:eastAsia="Noto Serif SC" w:hAnsi="Noto Serif SC" w:cs="Noto Serif"/>
-          <w:sz w:val="24"/>
-          <w:szCs w:val="24"/>
-          <w:lang w:val="en-US"/>
-        </w:rPr>
-      </w:pPr>
-    </w:p>
-    <w:p>
-      <w:pPr>
-        <w:jc w:val="right"/>
-        <w:rPr>
-          <w:rFonts w:ascii="Noto Serif SC" w:eastAsia="Noto Serif SC" w:hAnsi="Noto Serif SC" w:cs="Noto Serif"/>
-          <w:sz w:val="24"/>
-          <w:szCs w:val="24"/>
-          <w:lang w:val="en-US"/>
-        </w:rPr>
-      </w:pPr>
-      <w:r>
-        <w:rPr>
-          <w:rFonts w:ascii="Noto Serif SC" w:eastAsia="Noto Serif SC" w:hAnsi="Noto Serif SC" w:cs="Noto Serif"/>
-          <w:sz w:val="24"/>
-          <w:szCs w:val="24"/>
-        </w:rPr>
-        <w:t>箫</w:t>
-      </w:r>
-      <w:r>
-        <w:rPr>
-          <w:rFonts w:ascii="Noto Serif SC" w:eastAsia="Noto Serif SC" w:hAnsi="Noto Serif SC" w:cs="Noto Serif"/>
-          <w:sz w:val="24"/>
-          <w:szCs w:val="24"/>
-          <w:lang w:val="en-US"/>
-        </w:rPr>
-        <w:t xml:space="preserve"> (Xiao)</w:t>
-      </w:r>
-    </w:p>
-    <w:p>
-      <w:pPr>
-        <w:jc w:val="right"/>
-        <w:rPr>
-          <w:rFonts w:ascii="Noto Serif SC" w:eastAsia="Noto Serif SC" w:hAnsi="Noto Serif SC" w:cs="Noto Serif"/>
-          <w:sz w:val="24"/>
-          <w:szCs w:val="24"/>
-          <w:lang w:val="en-US"/>
-        </w:rPr>
-      </w:pPr>
-    </w:p>
-    <w:p>
-      <w:pPr>
-        <w:jc w:val="right"/>
-        <w:rPr>
-          <w:rFonts w:ascii="Noto Serif SC" w:eastAsia="Noto Serif SC" w:hAnsi="Noto Serif SC" w:cs="Noto Serif"/>
-          <w:sz w:val="24"/>
-          <w:szCs w:val="24"/>
-          <w:lang w:val="en-US"/>
-        </w:rPr>
-      </w:pPr>
-      <w:r>
-        <w:rPr>
-          <w:rFonts w:ascii="Noto Serif SC" w:eastAsia="Noto Serif SC" w:hAnsi="Noto Serif SC" w:cs="Noto Serif" w:hint="eastAsia"/>
-          <w:sz w:val="24"/>
-          <w:szCs w:val="24"/>
-          <w:lang w:val="en-US"/>
-        </w:rPr>
-        <w:t>扬琴</w:t>
-      </w:r>
-      <w:r>
-        <w:rPr>
-          <w:rFonts w:ascii="Noto Serif SC" w:eastAsia="Noto Serif SC" w:hAnsi="Noto Serif SC" w:cs="Noto Serif"/>
-          <w:sz w:val="24"/>
-          <w:szCs w:val="24"/>
-          <w:lang w:val="en-US"/>
-        </w:rPr>
-        <w:t xml:space="preserve"> (Yangqin)</w:t>
-      </w:r>
-    </w:p>
-    <w:p>
-      <w:pPr>
-        <w:jc w:val="right"/>
-        <w:rPr>
-          <w:rFonts w:ascii="Noto Serif SC" w:eastAsia="Noto Serif SC" w:hAnsi="Noto Serif SC" w:cs="Noto Serif"/>
-          <w:sz w:val="24"/>
-          <w:szCs w:val="24"/>
-          <w:lang w:val="en-US"/>
-        </w:rPr>
-      </w:pPr>
-      <w:r>
-        <w:rPr>
-          <w:rFonts w:ascii="Noto Serif SC" w:eastAsia="Noto Serif SC" w:hAnsi="Noto Serif SC" w:cs="Noto Serif" w:hint="eastAsia"/>
-          <w:sz w:val="24"/>
-          <w:szCs w:val="24"/>
-          <w:lang w:val="en-US"/>
-        </w:rPr>
-        <w:t>柳琴</w:t>
-      </w:r>
-      <w:r>
-        <w:rPr>
-          <w:rFonts w:ascii="Noto Serif SC" w:eastAsia="Noto Serif SC" w:hAnsi="Noto Serif SC" w:cs="Noto Serif"/>
-          <w:sz w:val="24"/>
-          <w:szCs w:val="24"/>
-          <w:lang w:val="en-US"/>
-        </w:rPr>
-        <w:t xml:space="preserve"> (</w:t>
-      </w:r>
-      <w:proofErr w:type="spellStart"/>
-      <w:r>
-        <w:rPr>
-          <w:rFonts w:ascii="Noto Serif SC" w:eastAsia="Noto Serif SC" w:hAnsi="Noto Serif SC" w:cs="Noto Serif"/>
-          <w:sz w:val="24"/>
-          <w:szCs w:val="24"/>
-          <w:lang w:val="en-US"/>
-        </w:rPr>
-        <w:t>Liuqin</w:t>
-      </w:r>
-      <w:proofErr w:type="spellEnd"/>
-      <w:r>
-        <w:rPr>
-          <w:rFonts w:ascii="Noto Serif SC" w:eastAsia="Noto Serif SC" w:hAnsi="Noto Serif SC" w:cs="Noto Serif"/>
-          <w:sz w:val="24"/>
-          <w:szCs w:val="24"/>
-          <w:lang w:val="en-US"/>
-        </w:rPr>
-        <w:t>)</w:t>
-      </w:r>
-    </w:p>
-    <w:p>
-      <w:pPr>
-        <w:jc w:val="right"/>
-        <w:rPr>
-          <w:rFonts w:ascii="Noto Serif SC" w:eastAsia="Noto Serif SC" w:hAnsi="Noto Serif SC" w:cs="Noto Serif"/>
-          <w:sz w:val="24"/>
-          <w:szCs w:val="24"/>
-          <w:lang w:val="en-US"/>
-        </w:rPr>
-      </w:pPr>
-      <w:r>
-        <w:rPr>
-          <w:rFonts w:ascii="Noto Serif SC" w:eastAsia="Noto Serif SC" w:hAnsi="Noto Serif SC" w:cs="Noto Serif" w:hint="eastAsia"/>
-          <w:sz w:val="24"/>
-          <w:szCs w:val="24"/>
-          <w:lang w:val="en-US"/>
-        </w:rPr>
-        <w:t>琵琶</w:t>
-      </w:r>
-      <w:r>
-        <w:rPr>
-          <w:rFonts w:ascii="Noto Serif SC" w:eastAsia="Noto Serif SC" w:hAnsi="Noto Serif SC" w:cs="Noto Serif"/>
-          <w:sz w:val="24"/>
-          <w:szCs w:val="24"/>
-          <w:lang w:val="en-US"/>
-        </w:rPr>
-        <w:t xml:space="preserve"> (Pipa)</w:t>
-      </w:r>
-    </w:p>
-    <w:p>
-      <w:pPr>
-        <w:jc w:val="right"/>
-        <w:rPr>
-          <w:rFonts w:ascii="Noto Serif SC" w:eastAsia="Noto Serif SC" w:hAnsi="Noto Serif SC" w:cs="Noto Serif"/>
-          <w:sz w:val="24"/>
-          <w:szCs w:val="24"/>
-          <w:lang w:val="en-US"/>
-        </w:rPr>
-      </w:pPr>
-      <w:r>
-        <w:rPr>
-          <w:rFonts w:ascii="Noto Serif SC" w:eastAsia="Noto Serif SC" w:hAnsi="Noto Serif SC" w:cs="Noto Serif" w:hint="eastAsia"/>
-          <w:sz w:val="24"/>
-          <w:szCs w:val="24"/>
-          <w:lang w:val="en-US"/>
-        </w:rPr>
-        <w:t>中阮</w:t>
-      </w:r>
-      <w:r>
-        <w:rPr>
-          <w:rFonts w:ascii="Noto Serif SC" w:eastAsia="Noto Serif SC" w:hAnsi="Noto Serif SC" w:cs="Noto Serif"/>
-          <w:sz w:val="24"/>
-          <w:szCs w:val="24"/>
-          <w:lang w:val="en-US"/>
-        </w:rPr>
-        <w:t xml:space="preserve"> (Zhongruan)</w:t>
-      </w:r>
-    </w:p>
-    <w:p>
-      <w:pPr>
-        <w:jc w:val="right"/>
-        <w:rPr>
-          <w:rFonts w:ascii="Noto Serif SC" w:eastAsia="Noto Serif SC" w:hAnsi="Noto Serif SC" w:cs="Noto Serif"/>
-          <w:sz w:val="24"/>
-          <w:szCs w:val="24"/>
-          <w:lang w:val="en-US"/>
-        </w:rPr>
-      </w:pPr>
-      <w:r>
-        <w:rPr>
-          <w:rFonts w:ascii="Noto Serif SC" w:eastAsia="Noto Serif SC" w:hAnsi="Noto Serif SC" w:cs="Noto Serif" w:hint="eastAsia"/>
-          <w:sz w:val="24"/>
-          <w:szCs w:val="24"/>
-        </w:rPr>
-        <w:t>三弦</w:t>
-      </w:r>
-      <w:r>
-        <w:rPr>
-          <w:rFonts w:ascii="Noto Serif SC" w:eastAsia="Noto Serif SC" w:hAnsi="Noto Serif SC" w:cs="Noto Serif"/>
-          <w:sz w:val="24"/>
-          <w:szCs w:val="24"/>
-          <w:lang w:val="en-US"/>
-        </w:rPr>
-        <w:t xml:space="preserve"> Sanxian</w:t>
-      </w:r>
-    </w:p>
-    <w:p>
-      <w:pPr>
-        <w:jc w:val="right"/>
-        <w:rPr>
-          <w:rFonts w:ascii="Noto Serif SC" w:eastAsia="Noto Serif SC" w:hAnsi="Noto Serif SC" w:cs="Noto Serif"/>
-          <w:sz w:val="24"/>
-          <w:szCs w:val="24"/>
-          <w:lang w:val="en-US"/>
-        </w:rPr>
-      </w:pPr>
-      <w:r>
-        <w:rPr>
-          <w:rFonts w:ascii="Noto Serif SC" w:eastAsia="Noto Serif SC" w:hAnsi="Noto Serif SC" w:cs="Noto Serif" w:hint="eastAsia"/>
-          <w:sz w:val="24"/>
-          <w:szCs w:val="24"/>
-          <w:lang w:val="en-US"/>
-        </w:rPr>
-        <w:t>大阮</w:t>
-      </w:r>
-      <w:r>
-        <w:rPr>
-          <w:rFonts w:ascii="Noto Serif SC" w:eastAsia="Noto Serif SC" w:hAnsi="Noto Serif SC" w:cs="Noto Serif"/>
-          <w:sz w:val="24"/>
-          <w:szCs w:val="24"/>
-          <w:lang w:val="en-US"/>
-        </w:rPr>
-        <w:t xml:space="preserve"> (Daruan)</w:t>
-      </w:r>
-    </w:p>
-    <w:p>
-      <w:pPr>
-        <w:jc w:val="right"/>
-        <w:rPr>
-          <w:rFonts w:ascii="Noto Serif SC" w:eastAsia="Noto Serif SC" w:hAnsi="Noto Serif SC" w:cs="Noto Serif"/>
-          <w:sz w:val="24"/>
-          <w:szCs w:val="24"/>
-          <w:lang w:val="en-US"/>
-        </w:rPr>
-      </w:pPr>
-    </w:p>
-    <w:p>
-      <w:pPr>
-        <w:jc w:val="right"/>
-        <w:rPr>
-          <w:rFonts w:ascii="Noto Serif SC" w:eastAsia="Noto Serif SC" w:hAnsi="Noto Serif SC" w:cs="Noto Serif"/>
-          <w:sz w:val="24"/>
-          <w:szCs w:val="24"/>
-          <w:lang w:val="en-US"/>
-        </w:rPr>
-      </w:pPr>
-      <w:r>
-        <w:rPr>
-          <w:rFonts w:ascii="Noto Serif SC" w:eastAsia="Noto Serif SC" w:hAnsi="Noto Serif SC" w:cs="Noto Serif" w:hint="eastAsia"/>
-          <w:sz w:val="24"/>
-          <w:szCs w:val="24"/>
-          <w:lang w:val="en-US"/>
-        </w:rPr>
-        <w:t>打击乐</w:t>
-      </w:r>
-      <w:r>
-        <w:rPr>
-          <w:rFonts w:ascii="Noto Serif SC" w:eastAsia="Noto Serif SC" w:hAnsi="Noto Serif SC" w:cs="Noto Serif"/>
-          <w:sz w:val="24"/>
-          <w:szCs w:val="24"/>
-          <w:lang w:val="en-US"/>
-        </w:rPr>
-        <w:t xml:space="preserve"> I (Percussion I)</w:t>
-      </w:r>
-    </w:p>
-    <w:p>
-      <w:pPr>
-        <w:jc w:val="right"/>
-        <w:rPr>
-          <w:rFonts w:ascii="Noto Serif SC" w:eastAsia="Noto Serif SC" w:hAnsi="Noto Serif SC" w:cs="Noto Serif"/>
           <w:sz w:val="20"/>
           <w:szCs w:val="20"/>
         </w:rPr>
-      </w:pPr>
+        <w:t xml:space="preserve"> (bottom row)</w:t>
+      </w:r>
       <w:r>
         <w:rPr>
           <w:rFonts w:ascii="Noto Serif SC" w:eastAsia="Noto Serif SC" w:hAnsi="Noto Serif SC" w:cs="Noto Serif"/>
           <w:sz w:val="20"/>
           <w:szCs w:val="20"/>
         </w:rPr>
-        <w:t xml:space="preserve">定音鼓 </w:t>
-      </w:r>
-      <w:r>
-        <w:rPr>
-          <w:rFonts w:ascii="Noto Serif SC" w:eastAsia="Noto Serif SC" w:hAnsi="Noto Serif SC" w:cs="Noto Serif"/>
+        <w:t xml:space="preserve">, </w:t>
+      </w:r>
+      <w:r>
+        <w:rPr>
+          <w:rFonts w:ascii="Noto Serif SC" w:eastAsia="Noto Serif SC" w:hAnsi="Noto Serif SC" w:cs="Noto Serif" w:hint="eastAsia"/>
           <w:sz w:val="20"/>
           <w:szCs w:val="20"/>
         </w:rPr>
-        <w:t>(</w:t>
-      </w:r>
-      <w:r>
-        <w:rPr>
-          <w:rFonts w:ascii="Noto Serif SC" w:eastAsia="Noto Serif SC" w:hAnsi="Noto Serif SC" w:cs="Noto Serif" w:hint="eastAsia"/>
+        <w:t>大军鼓</w:t>
+      </w:r>
+      <w:r>
+        <w:rPr>
+          <w:rFonts w:ascii="Noto Serif SC" w:eastAsia="Noto Serif SC" w:hAnsi="Noto Serif SC" w:cs="Noto Serif"/>
           <w:sz w:val="20"/>
           <w:szCs w:val="20"/>
         </w:rPr>
-        <w:t>Timpani</w:t>
+        <w:t xml:space="preserve"> Bass </w:t>
       </w:r>
       <w:r>
         <w:rPr>
@@ -4693,7 +5168,7 @@
           <w:sz w:val="20"/>
           <w:szCs w:val="20"/>
         </w:rPr>
-        <w:t xml:space="preserve">), </w:t>
+        <w:t>D</w:t>
       </w:r>
       <w:r>
         <w:rPr>
@@ -4701,24 +5176,25 @@
           <w:sz w:val="20"/>
           <w:szCs w:val="20"/>
         </w:rPr>
-        <w:t xml:space="preserve">大堂鼓 </w:t>
-      </w:r>
-      <w:r>
+        <w:t>rum</w:t>
+      </w:r>
+    </w:p>
+    <w:p>
+      <w:pPr>
         <w:rPr>
           <w:rFonts w:ascii="Noto Serif SC" w:eastAsia="Noto Serif SC" w:hAnsi="Noto Serif SC" w:cs="Noto Serif"/>
           <w:sz w:val="20"/>
           <w:szCs w:val="20"/>
         </w:rPr>
-        <w:t>(</w:t>
-      </w:r>
-      <w:proofErr w:type="spellStart"/>
+      </w:pPr>
       <w:r>
         <w:rPr>
           <w:rFonts w:ascii="Noto Serif SC" w:eastAsia="Noto Serif SC" w:hAnsi="Noto Serif SC" w:cs="Noto Serif"/>
           <w:sz w:val="20"/>
           <w:szCs w:val="20"/>
-        </w:rPr>
-        <w:t>Datangg</w:t>
+          <w:lang w:val="en-US"/>
+        </w:rPr>
+        <w:t xml:space="preserve">V: </w:t>
       </w:r>
       <w:r>
         <w:rPr>
@@ -4726,24 +5202,23 @@
           <w:sz w:val="20"/>
           <w:szCs w:val="20"/>
         </w:rPr>
-        <w:t>u</w:t>
-      </w:r>
-      <w:proofErr w:type="spellEnd"/>
+        <w:t>锣 Gon</w:t>
+      </w:r>
       <w:r>
         <w:rPr>
           <w:rFonts w:ascii="Noto Serif SC" w:eastAsia="Noto Serif SC" w:hAnsi="Noto Serif SC" w:cs="Noto Serif"/>
           <w:sz w:val="20"/>
           <w:szCs w:val="20"/>
         </w:rPr>
-        <w:t xml:space="preserve">), </w:t>
-      </w:r>
-      <w:r>
-        <w:rPr>
-          <w:rFonts w:ascii="Noto Serif SC" w:eastAsia="Noto Serif SC" w:hAnsi="Noto Serif SC" w:cs="Noto Serif"/>
+        <w:t xml:space="preserve">g, </w:t>
+      </w:r>
+      <w:r>
+        <w:rPr>
+          <w:rFonts w:ascii="Noto Serif SC" w:eastAsia="Noto Serif SC" w:hAnsi="Noto Serif SC" w:cs="Noto Serif" w:hint="eastAsia"/>
           <w:sz w:val="20"/>
           <w:szCs w:val="20"/>
         </w:rPr>
-        <w:t xml:space="preserve">堂鼓 </w:t>
+        <w:t>颤音琴</w:t>
       </w:r>
       <w:r>
         <w:rPr>
@@ -4751,597 +5226,53 @@
           <w:sz w:val="20"/>
           <w:szCs w:val="20"/>
         </w:rPr>
-        <w:t>(</w:t>
-      </w:r>
-      <w:proofErr w:type="spellStart"/>
-      <w:r>
-        <w:rPr>
-          <w:rFonts w:ascii="Noto Serif SC" w:eastAsia="Noto Serif SC" w:hAnsi="Noto Serif SC" w:cs="Noto Serif"/>
+        <w:t xml:space="preserve"> Vibraphone,</w:t>
+      </w:r>
+      <w:r>
+        <w:rPr>
+          <w:rFonts w:ascii="Noto Serif SC" w:eastAsia="Noto Serif SC" w:hAnsi="Noto Serif SC" w:cs="Noto Serif" w:hint="eastAsia"/>
           <w:sz w:val="20"/>
           <w:szCs w:val="20"/>
         </w:rPr>
-        <w:t>Xiaotanggu</w:t>
-      </w:r>
-      <w:proofErr w:type="spellEnd"/>
+        <w:t>大军鼓</w:t>
+      </w:r>
       <w:r>
         <w:rPr>
           <w:rFonts w:ascii="Noto Serif SC" w:eastAsia="Noto Serif SC" w:hAnsi="Noto Serif SC" w:cs="Noto Serif"/>
           <w:sz w:val="20"/>
           <w:szCs w:val="20"/>
         </w:rPr>
-        <w:t>)</w:t>
-      </w:r>
-    </w:p>
-    <w:p>
-      <w:pPr>
-        <w:jc w:val="right"/>
-        <w:rPr>
-          <w:rFonts w:ascii="Noto Serif SC" w:eastAsia="Noto Serif SC" w:hAnsi="Noto Serif SC" w:cs="Noto Serif"/>
-          <w:sz w:val="24"/>
-          <w:szCs w:val="24"/>
-          <w:lang w:val="en-US"/>
-        </w:rPr>
-      </w:pPr>
-      <w:r>
-        <w:rPr>
-          <w:rFonts w:ascii="Noto Serif SC" w:eastAsia="Noto Serif SC" w:hAnsi="Noto Serif SC" w:cs="Noto Serif" w:hint="eastAsia"/>
-          <w:sz w:val="24"/>
-          <w:szCs w:val="24"/>
-          <w:lang w:val="en-US"/>
-        </w:rPr>
-        <w:t>打击乐</w:t>
-      </w:r>
-      <w:r>
-        <w:rPr>
-          <w:rFonts w:ascii="Noto Serif SC" w:eastAsia="Noto Serif SC" w:hAnsi="Noto Serif SC" w:cs="Noto Serif"/>
-          <w:sz w:val="24"/>
-          <w:szCs w:val="24"/>
-          <w:lang w:val="en-US"/>
-        </w:rPr>
-        <w:t xml:space="preserve"> II (Percussion II)</w:t>
-      </w:r>
-    </w:p>
-    <w:p>
-      <w:pPr>
-        <w:jc w:val="right"/>
+        <w:t xml:space="preserve"> Bass </w:t>
+      </w:r>
+      <w:r>
         <w:rPr>
           <w:rFonts w:ascii="Noto Serif SC" w:eastAsia="Noto Serif SC" w:hAnsi="Noto Serif SC" w:cs="Noto Serif"/>
           <w:sz w:val="20"/>
           <w:szCs w:val="20"/>
-          <w:lang w:val="en-US"/>
-        </w:rPr>
-      </w:pPr>
-      <w:r>
-        <w:rPr>
-          <w:rFonts w:ascii="Noto Serif SC" w:eastAsia="Noto Serif SC" w:hAnsi="Noto Serif SC" w:cs="Noto Serif" w:hint="eastAsia"/>
+        </w:rPr>
+        <w:t>D</w:t>
+      </w:r>
+      <w:r>
+        <w:rPr>
+          <w:rFonts w:ascii="Noto Serif SC" w:eastAsia="Noto Serif SC" w:hAnsi="Noto Serif SC" w:cs="Noto Serif"/>
           <w:sz w:val="20"/>
           <w:szCs w:val="20"/>
         </w:rPr>
-        <w:t>排鼓</w:t>
-      </w:r>
-      <w:r>
-        <w:rPr>
-          <w:rFonts w:ascii="Noto Serif SC" w:eastAsia="Noto Serif SC" w:hAnsi="Noto Serif SC" w:cs="Noto Serif"/>
-          <w:sz w:val="20"/>
-          <w:szCs w:val="20"/>
-        </w:rPr>
-        <w:t xml:space="preserve"> </w:t>
-      </w:r>
-      <w:r>
-        <w:rPr>
-          <w:rFonts w:ascii="Noto Serif SC" w:eastAsia="Noto Serif SC" w:hAnsi="Noto Serif SC" w:cs="Noto Serif"/>
-          <w:sz w:val="20"/>
-          <w:szCs w:val="20"/>
-        </w:rPr>
-        <w:t>(</w:t>
-      </w:r>
-      <w:proofErr w:type="spellStart"/>
-      <w:r>
-        <w:rPr>
-          <w:rFonts w:ascii="Noto Serif SC" w:eastAsia="Noto Serif SC" w:hAnsi="Noto Serif SC" w:cs="Noto Serif"/>
-          <w:sz w:val="20"/>
-          <w:szCs w:val="20"/>
-        </w:rPr>
-        <w:t>Paigu</w:t>
-      </w:r>
-      <w:proofErr w:type="spellEnd"/>
-      <w:r>
-        <w:rPr>
-          <w:rFonts w:ascii="Noto Serif SC" w:eastAsia="Noto Serif SC" w:hAnsi="Noto Serif SC" w:cs="Noto Serif"/>
-          <w:sz w:val="20"/>
-          <w:szCs w:val="20"/>
-        </w:rPr>
-        <w:t>)</w:t>
-      </w:r>
-      <w:r>
-        <w:rPr>
-          <w:rFonts w:ascii="Noto Serif SC" w:eastAsia="Noto Serif SC" w:hAnsi="Noto Serif SC" w:cs="Noto Serif"/>
-          <w:sz w:val="20"/>
-          <w:szCs w:val="20"/>
-        </w:rPr>
-        <w:t xml:space="preserve">, </w:t>
-      </w:r>
-      <w:r>
-        <w:rPr>
-          <w:rFonts w:ascii="Noto Serif SC" w:eastAsia="Noto Serif SC" w:hAnsi="Noto Serif SC" w:cs="Noto Serif"/>
-          <w:sz w:val="20"/>
-          <w:szCs w:val="20"/>
-        </w:rPr>
-        <w:t xml:space="preserve">铃鼓 </w:t>
-      </w:r>
-      <w:r>
-        <w:rPr>
-          <w:rFonts w:ascii="Noto Serif SC" w:eastAsia="Noto Serif SC" w:hAnsi="Noto Serif SC" w:cs="Noto Serif"/>
-          <w:sz w:val="20"/>
-          <w:szCs w:val="20"/>
-        </w:rPr>
-        <w:t>(</w:t>
-      </w:r>
-      <w:r>
-        <w:rPr>
-          <w:rFonts w:ascii="Noto Serif SC" w:eastAsia="Noto Serif SC" w:hAnsi="Noto Serif SC" w:cs="Noto Serif"/>
-          <w:sz w:val="20"/>
-          <w:szCs w:val="20"/>
-        </w:rPr>
-        <w:t>Tambourine</w:t>
-      </w:r>
-      <w:r>
-        <w:rPr>
-          <w:rFonts w:ascii="Noto Serif SC" w:eastAsia="Noto Serif SC" w:hAnsi="Noto Serif SC" w:cs="Noto Serif"/>
-          <w:sz w:val="20"/>
-          <w:szCs w:val="20"/>
-        </w:rPr>
-        <w:t>)</w:t>
-      </w:r>
-    </w:p>
-    <w:p>
-      <w:pPr>
-        <w:jc w:val="right"/>
-        <w:rPr>
-          <w:rFonts w:ascii="Noto Serif SC" w:eastAsia="Noto Serif SC" w:hAnsi="Noto Serif SC" w:cs="Noto Serif"/>
-          <w:sz w:val="24"/>
-          <w:szCs w:val="24"/>
-          <w:lang w:val="en-US"/>
-        </w:rPr>
-      </w:pPr>
-      <w:r>
-        <w:rPr>
-          <w:rFonts w:ascii="Noto Serif SC" w:eastAsia="Noto Serif SC" w:hAnsi="Noto Serif SC" w:cs="Noto Serif" w:hint="eastAsia"/>
-          <w:sz w:val="24"/>
-          <w:szCs w:val="24"/>
-          <w:lang w:val="en-US"/>
-        </w:rPr>
-        <w:t>打击乐</w:t>
-      </w:r>
-      <w:r>
-        <w:rPr>
-          <w:rFonts w:ascii="Noto Serif SC" w:eastAsia="Noto Serif SC" w:hAnsi="Noto Serif SC" w:cs="Noto Serif"/>
-          <w:sz w:val="24"/>
-          <w:szCs w:val="24"/>
-          <w:lang w:val="en-US"/>
-        </w:rPr>
-        <w:t xml:space="preserve"> III (Percussion III)</w:t>
-      </w:r>
-    </w:p>
-    <w:p>
-      <w:pPr>
-        <w:jc w:val="right"/>
-        <w:rPr>
-          <w:rFonts w:ascii="Noto Serif SC" w:eastAsia="Noto Serif SC" w:hAnsi="Noto Serif SC" w:cs="Noto Serif"/>
-          <w:sz w:val="20"/>
-          <w:szCs w:val="20"/>
-        </w:rPr>
-      </w:pPr>
-      <w:r>
-        <w:rPr>
-          <w:rFonts w:ascii="Noto Serif SC" w:eastAsia="Noto Serif SC" w:hAnsi="Noto Serif SC" w:cs="Noto Serif" w:hint="eastAsia"/>
-          <w:sz w:val="20"/>
-          <w:szCs w:val="20"/>
-        </w:rPr>
-        <w:t>云锣</w:t>
-      </w:r>
-      <w:r>
-        <w:rPr>
-          <w:rFonts w:ascii="Noto Serif SC" w:eastAsia="Noto Serif SC" w:hAnsi="Noto Serif SC" w:cs="Noto Serif"/>
-          <w:sz w:val="20"/>
-          <w:szCs w:val="20"/>
-        </w:rPr>
-        <w:t xml:space="preserve"> </w:t>
-      </w:r>
-      <w:r>
-        <w:rPr>
-          <w:rFonts w:ascii="Noto Serif SC" w:eastAsia="Noto Serif SC" w:hAnsi="Noto Serif SC" w:cs="Noto Serif" w:hint="eastAsia"/>
-          <w:sz w:val="20"/>
-          <w:szCs w:val="20"/>
-        </w:rPr>
-        <w:t>(</w:t>
-      </w:r>
-      <w:r>
-        <w:rPr>
-          <w:rFonts w:ascii="Noto Serif SC" w:eastAsia="Noto Serif SC" w:hAnsi="Noto Serif SC" w:cs="Noto Serif"/>
-          <w:sz w:val="20"/>
-          <w:szCs w:val="20"/>
-        </w:rPr>
-        <w:t>Yunluo</w:t>
-      </w:r>
-      <w:r>
-        <w:rPr>
-          <w:rFonts w:ascii="Noto Serif SC" w:eastAsia="Noto Serif SC" w:hAnsi="Noto Serif SC" w:cs="Noto Serif" w:hint="eastAsia"/>
-          <w:sz w:val="20"/>
-          <w:szCs w:val="20"/>
-        </w:rPr>
-        <w:t>)</w:t>
-      </w:r>
-      <w:r>
-        <w:rPr>
-          <w:rFonts w:ascii="Noto Serif SC" w:eastAsia="Noto Serif SC" w:hAnsi="Noto Serif SC" w:cs="Noto Serif"/>
-          <w:sz w:val="20"/>
-          <w:szCs w:val="20"/>
-        </w:rPr>
-        <w:t>,</w:t>
-      </w:r>
-      <w:r>
-        <w:rPr>
-          <w:rFonts w:ascii="Noto Serif SC" w:eastAsia="Noto Serif SC" w:hAnsi="Noto Serif SC" w:cs="Noto Serif"/>
-          <w:sz w:val="20"/>
-          <w:szCs w:val="20"/>
-          <w:lang w:val="en-US"/>
-        </w:rPr>
-        <w:t xml:space="preserve"> </w:t>
-      </w:r>
-      <w:r>
-        <w:rPr>
-          <w:rFonts w:ascii="Noto Serif SC" w:eastAsia="Noto Serif SC" w:hAnsi="Noto Serif SC" w:cs="Noto Serif" w:hint="eastAsia"/>
-          <w:sz w:val="20"/>
-          <w:szCs w:val="20"/>
-        </w:rPr>
-        <w:t>木鱼</w:t>
-      </w:r>
-      <w:r>
-        <w:rPr>
-          <w:rFonts w:ascii="Noto Serif SC" w:eastAsia="Noto Serif SC" w:hAnsi="Noto Serif SC" w:cs="Noto Serif"/>
-          <w:sz w:val="20"/>
-          <w:szCs w:val="20"/>
-        </w:rPr>
-        <w:t xml:space="preserve"> (Woodblock),</w:t>
-      </w:r>
-      <w:r>
-        <w:t xml:space="preserve"> </w:t>
-      </w:r>
-      <w:r>
-        <w:rPr>
-          <w:rFonts w:ascii="Noto Serif SC" w:eastAsia="Noto Serif SC" w:hAnsi="Noto Serif SC" w:cs="Noto Serif"/>
-          <w:sz w:val="20"/>
-          <w:szCs w:val="20"/>
-        </w:rPr>
-        <w:t xml:space="preserve">吊钹 </w:t>
-      </w:r>
-      <w:r>
-        <w:rPr>
-          <w:rFonts w:ascii="Noto Serif SC" w:eastAsia="Noto Serif SC" w:hAnsi="Noto Serif SC" w:cs="Noto Serif"/>
-          <w:sz w:val="20"/>
-          <w:szCs w:val="20"/>
-        </w:rPr>
-        <w:t>(</w:t>
-      </w:r>
-      <w:r>
-        <w:rPr>
-          <w:rFonts w:ascii="Noto Serif SC" w:eastAsia="Noto Serif SC" w:hAnsi="Noto Serif SC" w:cs="Noto Serif"/>
-          <w:sz w:val="20"/>
-          <w:szCs w:val="20"/>
-        </w:rPr>
-        <w:t>Suspended Cymbals</w:t>
-      </w:r>
-      <w:r>
-        <w:rPr>
-          <w:rFonts w:ascii="Noto Serif SC" w:eastAsia="Noto Serif SC" w:hAnsi="Noto Serif SC" w:cs="Noto Serif"/>
-          <w:sz w:val="20"/>
-          <w:szCs w:val="20"/>
-        </w:rPr>
-        <w:t xml:space="preserve">), </w:t>
-      </w:r>
-      <w:r>
-        <w:rPr>
-          <w:rFonts w:ascii="Noto Serif SC" w:eastAsia="Noto Serif SC" w:hAnsi="Noto Serif SC" w:cs="Noto Serif"/>
-          <w:sz w:val="20"/>
-          <w:szCs w:val="20"/>
-        </w:rPr>
-        <w:t xml:space="preserve">军镲 </w:t>
-      </w:r>
-      <w:r>
-        <w:rPr>
-          <w:rFonts w:ascii="Noto Serif SC" w:eastAsia="Noto Serif SC" w:hAnsi="Noto Serif SC" w:cs="Noto Serif"/>
-          <w:sz w:val="20"/>
-          <w:szCs w:val="20"/>
-        </w:rPr>
-        <w:t>(</w:t>
-      </w:r>
-      <w:r>
-        <w:rPr>
-          <w:rFonts w:ascii="Noto Serif SC" w:eastAsia="Noto Serif SC" w:hAnsi="Noto Serif SC" w:cs="Noto Serif"/>
-          <w:sz w:val="20"/>
-          <w:szCs w:val="20"/>
-        </w:rPr>
-        <w:t>Crash Cymbals</w:t>
-      </w:r>
-      <w:r>
-        <w:rPr>
-          <w:rFonts w:ascii="Noto Serif SC" w:eastAsia="Noto Serif SC" w:hAnsi="Noto Serif SC" w:cs="Noto Serif"/>
-          <w:sz w:val="20"/>
-          <w:szCs w:val="20"/>
-        </w:rPr>
-        <w:t>)</w:t>
-      </w:r>
-    </w:p>
-    <w:p>
-      <w:pPr>
-        <w:jc w:val="right"/>
-        <w:rPr>
-          <w:rFonts w:ascii="Noto Serif SC" w:eastAsia="Noto Serif SC" w:hAnsi="Noto Serif SC" w:cs="Noto Serif"/>
-          <w:sz w:val="24"/>
-          <w:szCs w:val="24"/>
-          <w:lang w:val="en-US"/>
-        </w:rPr>
-      </w:pPr>
-      <w:r>
-        <w:rPr>
-          <w:rFonts w:ascii="Noto Serif SC" w:eastAsia="Noto Serif SC" w:hAnsi="Noto Serif SC" w:cs="Noto Serif" w:hint="eastAsia"/>
-          <w:sz w:val="24"/>
-          <w:szCs w:val="24"/>
-          <w:lang w:val="en-US"/>
-        </w:rPr>
-        <w:t>打击乐</w:t>
-      </w:r>
-      <w:r>
-        <w:rPr>
-          <w:rFonts w:ascii="Noto Serif SC" w:eastAsia="Noto Serif SC" w:hAnsi="Noto Serif SC" w:cs="Noto Serif"/>
-          <w:sz w:val="24"/>
-          <w:szCs w:val="24"/>
-          <w:lang w:val="en-US"/>
-        </w:rPr>
-        <w:t xml:space="preserve"> IV (Percussion IV)</w:t>
-      </w:r>
-    </w:p>
-    <w:p>
-      <w:pPr>
-        <w:jc w:val="right"/>
-        <w:rPr>
-          <w:rFonts w:ascii="Noto Serif SC" w:eastAsia="Noto Serif SC" w:hAnsi="Noto Serif SC" w:cs="Noto Serif"/>
-          <w:sz w:val="20"/>
-          <w:szCs w:val="20"/>
-        </w:rPr>
-      </w:pPr>
-      <w:r>
-        <w:rPr>
-          <w:rFonts w:ascii="Noto Serif SC" w:eastAsia="Noto Serif SC" w:hAnsi="Noto Serif SC" w:cs="Noto Serif"/>
-          <w:sz w:val="20"/>
-          <w:szCs w:val="20"/>
-        </w:rPr>
-        <w:t xml:space="preserve">编钟 (下层) </w:t>
-      </w:r>
-      <w:proofErr w:type="spellStart"/>
-      <w:r>
-        <w:rPr>
-          <w:rFonts w:ascii="Noto Serif SC" w:eastAsia="Noto Serif SC" w:hAnsi="Noto Serif SC" w:cs="Noto Serif"/>
-          <w:sz w:val="20"/>
-          <w:szCs w:val="20"/>
-        </w:rPr>
-        <w:t>Bianzhong</w:t>
-      </w:r>
-      <w:proofErr w:type="spellEnd"/>
-      <w:r>
-        <w:rPr>
-          <w:rFonts w:ascii="Noto Serif SC" w:eastAsia="Noto Serif SC" w:hAnsi="Noto Serif SC" w:cs="Noto Serif"/>
-          <w:sz w:val="20"/>
-          <w:szCs w:val="20"/>
-        </w:rPr>
-        <w:t xml:space="preserve"> (bottom row)</w:t>
-      </w:r>
-      <w:r>
-        <w:rPr>
-          <w:rFonts w:ascii="Noto Serif SC" w:eastAsia="Noto Serif SC" w:hAnsi="Noto Serif SC" w:cs="Noto Serif"/>
-          <w:sz w:val="20"/>
-          <w:szCs w:val="20"/>
-        </w:rPr>
-        <w:t xml:space="preserve">, </w:t>
-      </w:r>
-      <w:r>
-        <w:rPr>
-          <w:rFonts w:ascii="Noto Serif SC" w:eastAsia="Noto Serif SC" w:hAnsi="Noto Serif SC" w:cs="Noto Serif" w:hint="eastAsia"/>
-          <w:sz w:val="20"/>
-          <w:szCs w:val="20"/>
-        </w:rPr>
-        <w:t>大军鼓</w:t>
-      </w:r>
-      <w:r>
-        <w:rPr>
-          <w:rFonts w:ascii="Noto Serif SC" w:eastAsia="Noto Serif SC" w:hAnsi="Noto Serif SC" w:cs="Noto Serif"/>
-          <w:sz w:val="20"/>
-          <w:szCs w:val="20"/>
-        </w:rPr>
-        <w:t xml:space="preserve"> (Bass drum</w:t>
-      </w:r>
-      <w:r>
-        <w:rPr>
-          <w:rFonts w:ascii="Noto Serif SC" w:eastAsia="Noto Serif SC" w:hAnsi="Noto Serif SC" w:cs="Noto Serif"/>
-          <w:sz w:val="20"/>
-          <w:szCs w:val="20"/>
-        </w:rPr>
-        <w:t>)</w:t>
-      </w:r>
-    </w:p>
-    <w:p>
-      <w:pPr>
-        <w:jc w:val="right"/>
-        <w:rPr>
-          <w:rFonts w:ascii="Noto Serif SC" w:eastAsia="Noto Serif SC" w:hAnsi="Noto Serif SC" w:cs="Noto Serif"/>
-          <w:sz w:val="24"/>
-          <w:szCs w:val="24"/>
-          <w:lang w:val="en-US"/>
-        </w:rPr>
-      </w:pPr>
-      <w:r>
-        <w:rPr>
-          <w:rFonts w:ascii="Noto Serif SC" w:eastAsia="Noto Serif SC" w:hAnsi="Noto Serif SC" w:cs="Noto Serif" w:hint="eastAsia"/>
-          <w:sz w:val="24"/>
-          <w:szCs w:val="24"/>
-          <w:lang w:val="en-US"/>
-        </w:rPr>
-        <w:t>打击乐</w:t>
-      </w:r>
-      <w:r>
-        <w:rPr>
-          <w:rFonts w:ascii="Noto Serif SC" w:eastAsia="Noto Serif SC" w:hAnsi="Noto Serif SC" w:cs="Noto Serif"/>
-          <w:sz w:val="24"/>
-          <w:szCs w:val="24"/>
-          <w:lang w:val="en-US"/>
-        </w:rPr>
-        <w:t xml:space="preserve"> V (Percussion V)</w:t>
-      </w:r>
-    </w:p>
-    <w:p>
-      <w:pPr>
-        <w:jc w:val="right"/>
-        <w:rPr>
-          <w:rFonts w:ascii="Noto Serif SC" w:eastAsia="Noto Serif SC" w:hAnsi="Noto Serif SC" w:cs="Noto Serif"/>
-          <w:sz w:val="20"/>
-          <w:szCs w:val="20"/>
-        </w:rPr>
-      </w:pPr>
-      <w:r>
-        <w:rPr>
-          <w:rFonts w:ascii="Noto Serif SC" w:eastAsia="Noto Serif SC" w:hAnsi="Noto Serif SC" w:cs="Noto Serif"/>
-          <w:sz w:val="20"/>
-          <w:szCs w:val="20"/>
-        </w:rPr>
-        <w:t xml:space="preserve">锣 </w:t>
-      </w:r>
-      <w:r>
-        <w:rPr>
-          <w:rFonts w:ascii="Noto Serif SC" w:eastAsia="Noto Serif SC" w:hAnsi="Noto Serif SC" w:cs="Noto Serif"/>
-          <w:sz w:val="20"/>
-          <w:szCs w:val="20"/>
-        </w:rPr>
-        <w:t>(</w:t>
-      </w:r>
-      <w:r>
-        <w:rPr>
-          <w:rFonts w:ascii="Noto Serif SC" w:eastAsia="Noto Serif SC" w:hAnsi="Noto Serif SC" w:cs="Noto Serif"/>
-          <w:sz w:val="20"/>
-          <w:szCs w:val="20"/>
-        </w:rPr>
-        <w:t>Gon</w:t>
-      </w:r>
-      <w:r>
-        <w:rPr>
-          <w:rFonts w:ascii="Noto Serif SC" w:eastAsia="Noto Serif SC" w:hAnsi="Noto Serif SC" w:cs="Noto Serif"/>
-          <w:sz w:val="20"/>
-          <w:szCs w:val="20"/>
-        </w:rPr>
-        <w:t xml:space="preserve">g), </w:t>
-      </w:r>
-      <w:r>
-        <w:rPr>
-          <w:rFonts w:ascii="Noto Serif SC" w:eastAsia="Noto Serif SC" w:hAnsi="Noto Serif SC" w:cs="Noto Serif" w:hint="eastAsia"/>
-          <w:sz w:val="20"/>
-          <w:szCs w:val="20"/>
-        </w:rPr>
-        <w:t>颤音琴</w:t>
-      </w:r>
-      <w:r>
-        <w:rPr>
-          <w:rFonts w:ascii="Noto Serif SC" w:eastAsia="Noto Serif SC" w:hAnsi="Noto Serif SC" w:cs="Noto Serif"/>
-          <w:sz w:val="20"/>
-          <w:szCs w:val="20"/>
-        </w:rPr>
-        <w:t xml:space="preserve"> </w:t>
-      </w:r>
-      <w:r>
-        <w:rPr>
-          <w:rFonts w:ascii="Noto Serif SC" w:eastAsia="Noto Serif SC" w:hAnsi="Noto Serif SC" w:cs="Noto Serif"/>
-          <w:sz w:val="20"/>
-          <w:szCs w:val="20"/>
-        </w:rPr>
-        <w:t>(</w:t>
-      </w:r>
-      <w:r>
-        <w:rPr>
-          <w:rFonts w:ascii="Noto Serif SC" w:eastAsia="Noto Serif SC" w:hAnsi="Noto Serif SC" w:cs="Noto Serif"/>
-          <w:sz w:val="20"/>
-          <w:szCs w:val="20"/>
-        </w:rPr>
-        <w:t>Vibraphone</w:t>
-      </w:r>
-      <w:r>
-        <w:rPr>
-          <w:rFonts w:ascii="Noto Serif SC" w:eastAsia="Noto Serif SC" w:hAnsi="Noto Serif SC" w:cs="Noto Serif"/>
-          <w:sz w:val="20"/>
-          <w:szCs w:val="20"/>
-        </w:rPr>
-        <w:t>)</w:t>
-      </w:r>
-      <w:r>
-        <w:rPr>
-          <w:rFonts w:ascii="Noto Serif SC" w:eastAsia="Noto Serif SC" w:hAnsi="Noto Serif SC" w:cs="Noto Serif"/>
-          <w:sz w:val="20"/>
-          <w:szCs w:val="20"/>
-        </w:rPr>
-        <w:t>,</w:t>
-      </w:r>
-      <w:r>
-        <w:rPr>
-          <w:rFonts w:ascii="Noto Serif SC" w:eastAsia="Noto Serif SC" w:hAnsi="Noto Serif SC" w:cs="Noto Serif" w:hint="eastAsia"/>
-          <w:sz w:val="20"/>
-          <w:szCs w:val="20"/>
-        </w:rPr>
-        <w:t>大军鼓</w:t>
-      </w:r>
-      <w:r>
-        <w:rPr>
-          <w:rFonts w:ascii="Noto Serif SC" w:eastAsia="Noto Serif SC" w:hAnsi="Noto Serif SC" w:cs="Noto Serif"/>
-          <w:sz w:val="20"/>
-          <w:szCs w:val="20"/>
-        </w:rPr>
-        <w:t xml:space="preserve"> </w:t>
-      </w:r>
-      <w:r>
-        <w:rPr>
-          <w:rFonts w:ascii="Noto Serif SC" w:eastAsia="Noto Serif SC" w:hAnsi="Noto Serif SC" w:cs="Noto Serif"/>
-          <w:sz w:val="20"/>
-          <w:szCs w:val="20"/>
-        </w:rPr>
-        <w:t>(</w:t>
-      </w:r>
-      <w:r>
-        <w:rPr>
-          <w:rFonts w:ascii="Noto Serif SC" w:eastAsia="Noto Serif SC" w:hAnsi="Noto Serif SC" w:cs="Noto Serif"/>
-          <w:sz w:val="20"/>
-          <w:szCs w:val="20"/>
-        </w:rPr>
-        <w:t>Bass drum</w:t>
-      </w:r>
-      <w:r>
-        <w:rPr>
-          <w:rFonts w:ascii="Noto Serif SC" w:eastAsia="Noto Serif SC" w:hAnsi="Noto Serif SC" w:cs="Noto Serif"/>
-          <w:sz w:val="20"/>
-          <w:szCs w:val="20"/>
-        </w:rPr>
-        <w:t>)</w:t>
-      </w:r>
-    </w:p>
-    <w:p>
-      <w:pPr>
-        <w:rPr>
-          <w:rFonts w:ascii="Noto Serif SC" w:eastAsia="Noto Serif SC" w:hAnsi="Noto Serif SC" w:cs="Noto Serif"/>
-          <w:sz w:val="24"/>
-          <w:szCs w:val="24"/>
-          <w:lang w:val="en-US"/>
-        </w:rPr>
-      </w:pPr>
-    </w:p>
-    <w:p>
-      <w:pPr>
-        <w:jc w:val="right"/>
+        <w:t>rum</w:t>
+      </w:r>
+    </w:p>
+    <w:p>
+      <w:pPr>
+        <w:rPr>
+          <w:rFonts w:ascii="Noto Serif SC" w:eastAsia="Noto Serif SC" w:hAnsi="Noto Serif SC" w:cs="Noto Serif"/>
+          <w:sz w:val="24"/>
+          <w:szCs w:val="24"/>
+          <w:lang w:val="en-US"/>
+        </w:rPr>
+      </w:pPr>
+    </w:p>
+    <w:p>
+      <w:pPr>
         <w:rPr>
           <w:rFonts w:ascii="Noto Serif SC" w:eastAsia="Noto Serif SC" w:hAnsi="Noto Serif SC" w:cs="Noto Serif"/>
           <w:sz w:val="24"/>
@@ -5365,12 +5296,11 @@
           <w:szCs w:val="24"/>
           <w:lang w:val="en-US"/>
         </w:rPr>
-        <w:t xml:space="preserve"> (Gaohu)</w:t>
-      </w:r>
-    </w:p>
-    <w:p>
-      <w:pPr>
-        <w:jc w:val="right"/>
+        <w:t xml:space="preserve"> Gaohu</w:t>
+      </w:r>
+    </w:p>
+    <w:p>
+      <w:pPr>
         <w:rPr>
           <w:rFonts w:ascii="Noto Serif SC" w:eastAsia="Noto Serif SC" w:hAnsi="Noto Serif SC" w:cs="Noto Serif"/>
           <w:sz w:val="24"/>
@@ -5394,12 +5324,11 @@
           <w:szCs w:val="24"/>
           <w:lang w:val="en-US"/>
         </w:rPr>
-        <w:t xml:space="preserve"> (Erhu)</w:t>
-      </w:r>
-    </w:p>
-    <w:p>
-      <w:pPr>
-        <w:jc w:val="right"/>
+        <w:t xml:space="preserve"> Erhu</w:t>
+      </w:r>
+    </w:p>
+    <w:p>
+      <w:pPr>
         <w:rPr>
           <w:rFonts w:ascii="Noto Serif SC" w:eastAsia="Noto Serif SC" w:hAnsi="Noto Serif SC" w:cs="Noto Serif"/>
           <w:sz w:val="24"/>
@@ -5423,12 +5352,11 @@
           <w:szCs w:val="24"/>
           <w:lang w:val="en-US"/>
         </w:rPr>
-        <w:t xml:space="preserve"> (Zhonghu)</w:t>
-      </w:r>
-    </w:p>
-    <w:p>
-      <w:pPr>
-        <w:jc w:val="right"/>
+        <w:t xml:space="preserve"> Zhonghu</w:t>
+      </w:r>
+    </w:p>
+    <w:p>
+      <w:pPr>
         <w:rPr>
           <w:rFonts w:ascii="Noto Serif SC" w:eastAsia="Noto Serif SC" w:hAnsi="Noto Serif SC" w:cs="Noto Serif"/>
           <w:sz w:val="24"/>
@@ -5452,12 +5380,11 @@
           <w:szCs w:val="24"/>
           <w:lang w:val="en-US"/>
         </w:rPr>
-        <w:t xml:space="preserve"> (Violoncello)</w:t>
-      </w:r>
-    </w:p>
-    <w:p>
-      <w:pPr>
-        <w:jc w:val="right"/>
+        <w:t xml:space="preserve"> Violoncello</w:t>
+      </w:r>
+    </w:p>
+    <w:p>
+      <w:pPr>
         <w:rPr>
           <w:rFonts w:ascii="Noto Serif SC" w:eastAsia="Noto Serif SC" w:hAnsi="Noto Serif SC" w:cs="Noto Serif"/>
           <w:sz w:val="24"/>
@@ -5481,7 +5408,7 @@
           <w:szCs w:val="24"/>
           <w:lang w:val="en-US"/>
         </w:rPr>
-        <w:t xml:space="preserve"> (Contrabass)</w:t>
+        <w:t xml:space="preserve"> Contrabass</w:t>
       </w:r>
     </w:p>
     <w:p>

</xml_diff>

<commit_message>
Piece 5 - apostrophes
</commit_message>
<xml_diff>
--- a/Front Matter/Template/5_Front-Matter.docx
+++ b/Front Matter/Template/5_Front-Matter.docx
@@ -3114,7 +3114,23 @@
           <w:sz w:val="24"/>
           <w:szCs w:val="24"/>
         </w:rPr>
-        <w:t xml:space="preserve">, Jeremy Thurlow and Cheryl Frances-Hoad, and also academic lessons with Martin Ennis, Tim Watts and Gareth Wilson, along with several others. He was involved in the College’s Chapel Choir and numerous recitals organised by the Music Society. In 2016, he was awarded the Sophia </w:t>
+        <w:t>, Jeremy Thurlow and Cheryl Frances-Hoad, and also academic lessons with Martin Ennis, Tim Watts and Gareth Wilson, along with several others. He was involved in the College</w:t>
+      </w:r>
+      <w:r>
+        <w:rPr>
+          <w:rFonts w:ascii="Noto Serif SC" w:eastAsia="Noto Serif SC" w:hAnsi="Noto Serif SC" w:cs="Noto Serif"/>
+          <w:sz w:val="24"/>
+          <w:szCs w:val="24"/>
+        </w:rPr>
+        <w:t>'</w:t>
+      </w:r>
+      <w:r>
+        <w:rPr>
+          <w:rFonts w:ascii="Noto Serif SC" w:eastAsia="Noto Serif SC" w:hAnsi="Noto Serif SC" w:cs="Noto Serif"/>
+          <w:sz w:val="24"/>
+          <w:szCs w:val="24"/>
+        </w:rPr>
+        <w:t xml:space="preserve">s Chapel Choir and numerous recitals organised by the Music Society. In 2016, he was awarded the Sophia </w:t>
       </w:r>
       <w:proofErr w:type="spellStart"/>
       <w:r>

</xml_diff>